<commit_message>
Document IAR/OAR web delivery, DownloadStatus, and download.php
Updates the stale "no download link is produced yet" note on SaveIAR
with the actual shipped behavior: completed IAR/OAR saves are moved
to htdocs and served by Apache, with optional email notification and
expiring links. Documents the new DownloadStatus polling command and
SaveOAR's self-service estate-owner path, and adds a new "Web
Download Pages" section covering download.php, the self-service
browser UI that wraps all of this.

Co-Authored-By: Claude Sonnet 5 <noreply@anthropic.com>
</commit_message>
<xml_diff>
--- a/API.docx
+++ b/API.docx
@@ -9,10 +9,7 @@
       <w:bookmarkStart w:id="0" w:name="OLE_LINK1"/>
       <w:bookmarkStart w:id="1" w:name="OLE_LINK2"/>
       <w:r>
-        <w:t>DreamGrid API</w:t>
-      </w:r>
-      <w:r>
-        <w:t xml:space="preserve"> ReferENCE</w:t>
+        <w:t xml:space="preserve">DreamGrid API ReferENCE</w:t>
       </w:r>
     </w:p>
     <w:bookmarkEnd w:id="0"/>
@@ -27,116 +24,28 @@
         <w:spacing w:line="240" w:lineRule="auto"/>
       </w:pPr>
       <w:r>
-        <w:t>This is a from-source rewrite of the old !Manuals\API.docx, current as of the Modules\</w:t>
-      </w:r>
-      <w:proofErr w:type="spellStart"/>
-      <w:r>
-        <w:t>Webserver.vb</w:t>
-      </w:r>
-      <w:proofErr w:type="spellEnd"/>
-      <w:r>
-        <w:t xml:space="preserve"> / Classes\</w:t>
-      </w:r>
-      <w:proofErr w:type="spellStart"/>
-      <w:r>
-        <w:t>ClassWebServer.vb</w:t>
-      </w:r>
-      <w:proofErr w:type="spellEnd"/>
-      <w:r>
-        <w:t xml:space="preserve"> source in this repository. It replaces stale/inaccurate parts of the old doc (noted below) and adds commands that exist in the code but were never documented.</w:t>
-      </w:r>
-    </w:p>
-    <w:p>
-      <w:pPr>
-        <w:spacing w:line="240" w:lineRule="auto"/>
-      </w:pPr>
-    </w:p>
-    <w:p>
-      <w:pPr>
-        <w:spacing w:line="240" w:lineRule="auto"/>
-      </w:pPr>
-      <w:r>
-        <w:t xml:space="preserve">DreamGrid exposes a small HTTP API on the diagnostics port (Settings-&gt; Network Ports; default 8001) for remote control, region </w:t>
-      </w:r>
-      <w:proofErr w:type="spellStart"/>
-      <w:r>
-        <w:t>listing,teleport</w:t>
-      </w:r>
-      <w:proofErr w:type="spellEnd"/>
-      <w:r>
-        <w:t xml:space="preserve"> signs, and text-to-speech. All of it is served by the </w:t>
-      </w:r>
-      <w:proofErr w:type="spellStart"/>
-      <w:r>
-        <w:t>samelistener</w:t>
-      </w:r>
-      <w:proofErr w:type="spellEnd"/>
-      <w:r>
-        <w:t xml:space="preserve"> - see Classes\</w:t>
-      </w:r>
-      <w:proofErr w:type="spellStart"/>
-      <w:r>
-        <w:t>ClassWebServer.vb</w:t>
-      </w:r>
-      <w:proofErr w:type="spellEnd"/>
-      <w:r>
-        <w:t xml:space="preserve"> - and dispatched </w:t>
-      </w:r>
-      <w:proofErr w:type="spellStart"/>
-      <w:r>
-        <w:t>byModules</w:t>
-      </w:r>
-      <w:proofErr w:type="spellEnd"/>
-      <w:r>
-        <w:t>\</w:t>
-      </w:r>
-      <w:proofErr w:type="spellStart"/>
-      <w:r>
-        <w:t>Webserver.vb's</w:t>
-      </w:r>
-      <w:proofErr w:type="spellEnd"/>
-      <w:r>
-        <w:t xml:space="preserve"> </w:t>
-      </w:r>
-      <w:proofErr w:type="spellStart"/>
-      <w:r>
-        <w:t>ParsePost</w:t>
-      </w:r>
-      <w:proofErr w:type="spellEnd"/>
-      <w:r>
-        <w:t>/</w:t>
-      </w:r>
-      <w:proofErr w:type="spellStart"/>
-      <w:r>
-        <w:t>CommandProcess</w:t>
-      </w:r>
-      <w:proofErr w:type="spellEnd"/>
-      <w:r>
-        <w:t xml:space="preserve"> functions.</w:t>
-      </w:r>
-    </w:p>
-    <w:p>
-      <w:pPr>
-        <w:spacing w:line="240" w:lineRule="auto"/>
-      </w:pPr>
-      <w:r>
-        <w:t xml:space="preserve">(DreamGrid also exposes this same control surface as an MCP </w:t>
-      </w:r>
-      <w:proofErr w:type="spellStart"/>
-      <w:r>
-        <w:t>serverfor</w:t>
-      </w:r>
-      <w:proofErr w:type="spellEnd"/>
-      <w:r>
-        <w:t xml:space="preserve"> AI clients like Claude, at /</w:t>
-      </w:r>
-      <w:proofErr w:type="spellStart"/>
-      <w:r>
-        <w:t>mcp</w:t>
-      </w:r>
-      <w:proofErr w:type="spellEnd"/>
-      <w:r>
-        <w:t xml:space="preserve"> on </w:t>
+        <w:t xml:space="preserve">This is a from-source rewrite of the old !Manuals\API.docx, current as of the Modules\Webserver.vb / Classes\ClassWebServer.vb source in this repository. It replaces stale/inaccurate parts of the old doc (noted below) and adds commands that exist in the code but were never documented.</w:t>
+      </w:r>
+    </w:p>
+    <w:p>
+      <w:pPr>
+        <w:spacing w:line="240" w:lineRule="auto"/>
+      </w:pPr>
+    </w:p>
+    <w:p>
+      <w:pPr>
+        <w:spacing w:line="240" w:lineRule="auto"/>
+      </w:pPr>
+      <w:r>
+        <w:t xml:space="preserve">DreamGrid exposes a small HTTP API on the diagnostics port (Settings-&gt; Network Ports; default 8001) for remote control, region listing,teleport signs, and text-to-speech. All of it is served by the samelistener - see Classes\ClassWebServer.vb - and dispatched byModules\Webserver.vb's ParsePost/CommandProcess functions.</w:t>
+      </w:r>
+    </w:p>
+    <w:p>
+      <w:pPr>
+        <w:spacing w:line="240" w:lineRule="auto"/>
+      </w:pPr>
+      <w:r>
+        <w:t xml:space="preserve">(DreamGrid also exposes this same control surface as an MCP serverfor AI clients like Claude, at /mcp on </w:t>
       </w:r>
     </w:p>
     <w:p>
@@ -173,135 +82,39 @@
         <w:spacing w:line="240" w:lineRule="auto"/>
       </w:pPr>
       <w:r>
-        <w:t xml:space="preserve">        command={</w:t>
-      </w:r>
-      <w:proofErr w:type="spellStart"/>
-      <w:r>
-        <w:t>UrlEncode</w:t>
-      </w:r>
-      <w:proofErr w:type="spellEnd"/>
-      <w:r>
-        <w:t>(command)}</w:t>
-      </w:r>
-    </w:p>
-    <w:p>
-      <w:pPr>
-        <w:spacing w:line="240" w:lineRule="auto"/>
-      </w:pPr>
-      <w:r>
-        <w:t xml:space="preserve">        &amp;password={</w:t>
-      </w:r>
-      <w:proofErr w:type="spellStart"/>
-      <w:r>
-        <w:t>UrlEncode</w:t>
-      </w:r>
-      <w:proofErr w:type="spellEnd"/>
-      <w:r>
-        <w:t>(</w:t>
-      </w:r>
-      <w:proofErr w:type="spellStart"/>
-      <w:r>
-        <w:t>MachineHash</w:t>
-      </w:r>
-      <w:proofErr w:type="spellEnd"/>
-      <w:r>
-        <w:t xml:space="preserve"> or avatar password)}</w:t>
-      </w:r>
-    </w:p>
-    <w:p>
-      <w:pPr>
-        <w:spacing w:line="240" w:lineRule="auto"/>
-      </w:pPr>
-      <w:r>
-        <w:t xml:space="preserve">        &amp;avatar={</w:t>
-      </w:r>
-      <w:proofErr w:type="spellStart"/>
-      <w:r>
-        <w:t>UrlEncode</w:t>
-      </w:r>
-      <w:proofErr w:type="spellEnd"/>
-      <w:r>
-        <w:t>(</w:t>
-      </w:r>
-      <w:proofErr w:type="spellStart"/>
-      <w:r>
-        <w:t>AvatarName</w:t>
-      </w:r>
-      <w:proofErr w:type="spellEnd"/>
-      <w:r>
-        <w:t>)}          (needed for avatar-level auth)</w:t>
-      </w:r>
-    </w:p>
-    <w:p>
-      <w:pPr>
-        <w:spacing w:line="240" w:lineRule="auto"/>
-      </w:pPr>
-      <w:r>
-        <w:t xml:space="preserve">        &amp;</w:t>
-      </w:r>
-      <w:proofErr w:type="spellStart"/>
-      <w:r>
-        <w:t>RegionUUID</w:t>
-      </w:r>
-      <w:proofErr w:type="spellEnd"/>
-      <w:r>
-        <w:t>={</w:t>
-      </w:r>
-      <w:proofErr w:type="spellStart"/>
-      <w:r>
-        <w:t>UrlEncode</w:t>
-      </w:r>
-      <w:proofErr w:type="spellEnd"/>
-      <w:r>
-        <w:t>(</w:t>
-      </w:r>
-      <w:proofErr w:type="spellStart"/>
-      <w:r>
-        <w:t>regionUuid</w:t>
-      </w:r>
-      <w:proofErr w:type="spellEnd"/>
-      <w:r>
-        <w:t>)}      (region commands)</w:t>
-      </w:r>
-    </w:p>
-    <w:p>
-      <w:pPr>
-        <w:spacing w:line="240" w:lineRule="auto"/>
-      </w:pPr>
-      <w:r>
-        <w:t xml:space="preserve">        &amp;</w:t>
-      </w:r>
-      <w:proofErr w:type="spellStart"/>
-      <w:r>
-        <w:t>RegionName</w:t>
-      </w:r>
-      <w:proofErr w:type="spellEnd"/>
-      <w:r>
-        <w:t>={</w:t>
-      </w:r>
-      <w:proofErr w:type="spellStart"/>
-      <w:r>
-        <w:t>UrlEncode</w:t>
-      </w:r>
-      <w:proofErr w:type="spellEnd"/>
-      <w:r>
-        <w:t>(</w:t>
-      </w:r>
-      <w:proofErr w:type="spellStart"/>
-      <w:r>
-        <w:t>regionName</w:t>
-      </w:r>
-      <w:proofErr w:type="spellEnd"/>
-      <w:r>
-        <w:t xml:space="preserve">)}      (region commands, alternative to </w:t>
-      </w:r>
-      <w:proofErr w:type="spellStart"/>
-      <w:r>
-        <w:t>RegionUUID</w:t>
-      </w:r>
-      <w:proofErr w:type="spellEnd"/>
-      <w:r>
-        <w:t>)</w:t>
+        <w:t xml:space="preserve">        command={UrlEncode(command)}</w:t>
+      </w:r>
+    </w:p>
+    <w:p>
+      <w:pPr>
+        <w:spacing w:line="240" w:lineRule="auto"/>
+      </w:pPr>
+      <w:r>
+        <w:t xml:space="preserve">        &amp;password={UrlEncode(MachineHash or avatar password)}</w:t>
+      </w:r>
+    </w:p>
+    <w:p>
+      <w:pPr>
+        <w:spacing w:line="240" w:lineRule="auto"/>
+      </w:pPr>
+      <w:r>
+        <w:t xml:space="preserve">        &amp;avatar={UrlEncode(AvatarName)}          (needed for avatar-level auth)</w:t>
+      </w:r>
+    </w:p>
+    <w:p>
+      <w:pPr>
+        <w:spacing w:line="240" w:lineRule="auto"/>
+      </w:pPr>
+      <w:r>
+        <w:t xml:space="preserve">        &amp;RegionUUID={UrlEncode(regionUuid)}      (region commands)</w:t>
+      </w:r>
+    </w:p>
+    <w:p>
+      <w:pPr>
+        <w:spacing w:line="240" w:lineRule="auto"/>
+      </w:pPr>
+      <w:r>
+        <w:t xml:space="preserve">        &amp;RegionName={UrlEncode(regionName)}      (region commands, alternative to RegionUUID)</w:t>
       </w:r>
     </w:p>
     <w:p>
@@ -345,21 +158,7 @@
         <w:ind w:left="1440" w:hanging="1440"/>
       </w:pPr>
       <w:r>
-        <w:t xml:space="preserve">password     required  Either the grid's </w:t>
-      </w:r>
-      <w:proofErr w:type="spellStart"/>
-      <w:r>
-        <w:t>MachineHash</w:t>
-      </w:r>
-      <w:proofErr w:type="spellEnd"/>
-      <w:r>
-        <w:t xml:space="preserve"> (see</w:t>
-      </w:r>
-      <w:r>
-        <w:t xml:space="preserve"> </w:t>
-      </w:r>
-      <w:r>
-        <w:t>"Authentication" below) for full admin</w:t>
+        <w:t xml:space="preserve">password     required  Either the grid's MachineHash (see "Authentication" below) for full admin</w:t>
       </w:r>
     </w:p>
     <w:p>
@@ -368,13 +167,7 @@
         <w:ind w:left="1440" w:hanging="1440"/>
       </w:pPr>
       <w:r>
-        <w:t xml:space="preserve">                         access, or a normal avatar's login password</w:t>
-      </w:r>
-      <w:r>
-        <w:t xml:space="preserve"> </w:t>
-      </w:r>
-      <w:r>
-        <w:t>for a lower, avatar-level permission.</w:t>
+        <w:t xml:space="preserve">                         access, or a normal avatar's login password for a lower, avatar-level permission.</w:t>
       </w:r>
     </w:p>
     <w:p>
@@ -384,20 +177,8 @@
       </w:pPr>
       <w:r>
         <w:t xml:space="preserve">avatar    </w:t>
-      </w:r>
-      <w:r>
         <w:tab/>
-      </w:r>
-      <w:r>
-        <w:t xml:space="preserve">optional    Avatar name to check permission level for, when not using the </w:t>
-      </w:r>
-      <w:proofErr w:type="spellStart"/>
-      <w:r>
-        <w:t>MachineHash</w:t>
-      </w:r>
-      <w:proofErr w:type="spellEnd"/>
-      <w:r>
-        <w:t>.</w:t>
+        <w:t xml:space="preserve">optional    Avatar name to check permission level for, when not using the MachineHash.</w:t>
       </w:r>
     </w:p>
     <w:p>
@@ -405,19 +186,8 @@
         <w:spacing w:line="240" w:lineRule="auto"/>
         <w:ind w:left="1440" w:hanging="1440"/>
       </w:pPr>
-      <w:proofErr w:type="spellStart"/>
-      <w:r>
-        <w:t>RegionUUID</w:t>
-      </w:r>
-      <w:proofErr w:type="spellEnd"/>
-      <w:r>
-        <w:t xml:space="preserve">  optional    Target region's UUID. URL-escape as needed</w:t>
-      </w:r>
-      <w:r>
-        <w:t xml:space="preserve"> </w:t>
-      </w:r>
-      <w:r>
-        <w:t xml:space="preserve"> (e.g. %2D for a hyphen).</w:t>
+      <w:r>
+        <w:t xml:space="preserve">RegionUUID  optional    Target region's UUID. URL-escape as needed  (e.g. %2D for a hyphen).</w:t>
       </w:r>
     </w:p>
     <w:p>
@@ -425,37 +195,8 @@
         <w:spacing w:line="240" w:lineRule="auto"/>
         <w:ind w:left="2520" w:hanging="2520"/>
       </w:pPr>
-      <w:proofErr w:type="spellStart"/>
-      <w:r>
-        <w:t>RegionName</w:t>
-      </w:r>
-      <w:proofErr w:type="spellEnd"/>
-      <w:r>
-        <w:t xml:space="preserve"> optional    Target region's name instead of its UUID (e.g. %20 for a space). Resolved to a </w:t>
-      </w:r>
-      <w:proofErr w:type="spellStart"/>
-      <w:r>
-        <w:t>UUIDinternally</w:t>
-      </w:r>
-      <w:proofErr w:type="spellEnd"/>
-      <w:r>
-        <w:t xml:space="preserve">. Use </w:t>
-      </w:r>
-      <w:proofErr w:type="spellStart"/>
-      <w:r>
-        <w:t>RegionUUID</w:t>
-      </w:r>
-      <w:proofErr w:type="spellEnd"/>
-      <w:r>
-        <w:t xml:space="preserve"> or </w:t>
-      </w:r>
-      <w:proofErr w:type="spellStart"/>
-      <w:r>
-        <w:t>RegionName</w:t>
-      </w:r>
-      <w:proofErr w:type="spellEnd"/>
-      <w:r>
-        <w:t>, not both.</w:t>
+      <w:r>
+        <w:t xml:space="preserve">RegionName optional    Target region's name instead of its UUID (e.g. %20 for a space). Resolved to a UUIDinternally. Use RegionUUID or RegionName, not both.</w:t>
       </w:r>
     </w:p>
     <w:p>
@@ -473,13 +214,7 @@
         <w:ind w:left="1440" w:hanging="1440"/>
       </w:pPr>
       <w:r>
-        <w:t xml:space="preserve">             </w:t>
-      </w:r>
-      <w:r>
-        <w:t>S</w:t>
-      </w:r>
-      <w:r>
-        <w:t>pecific</w:t>
+        <w:t xml:space="preserve">             Specific</w:t>
       </w:r>
     </w:p>
     <w:p>
@@ -497,15 +232,7 @@
         <w:ind w:left="1440" w:hanging="1440"/>
       </w:pPr>
       <w:r>
-        <w:t>param        command-    Used by the "</w:t>
-      </w:r>
-      <w:proofErr w:type="spellStart"/>
-      <w:r>
-        <w:t>SetStatus</w:t>
-      </w:r>
-      <w:proofErr w:type="spellEnd"/>
-      <w:r>
-        <w:t>" command.</w:t>
+        <w:t>param        command-    Used by the "SetStatus" command.</w:t>
       </w:r>
     </w:p>
     <w:p>
@@ -522,33 +249,8 @@
         <w:spacing w:line="240" w:lineRule="auto"/>
         <w:ind w:left="1440" w:hanging="1440"/>
       </w:pPr>
-      <w:proofErr w:type="spellStart"/>
-      <w:r>
-        <w:t>AvatarName</w:t>
-      </w:r>
-      <w:proofErr w:type="spellEnd"/>
-      <w:r>
-        <w:t xml:space="preserve">   command-    Used by "</w:t>
-      </w:r>
-      <w:proofErr w:type="spellStart"/>
-      <w:r>
-        <w:t>SaveIAR</w:t>
-      </w:r>
-      <w:proofErr w:type="spellEnd"/>
-      <w:r>
-        <w:t>" (the avatar whose</w:t>
-      </w:r>
-      <w:r>
-        <w:t xml:space="preserve"> </w:t>
-      </w:r>
-      <w:r>
-        <w:t>specific</w:t>
-      </w:r>
-      <w:r>
-        <w:t xml:space="preserve"> </w:t>
-      </w:r>
-      <w:r>
-        <w:t>inventory to archive).</w:t>
+      <w:r>
+        <w:t xml:space="preserve">AvatarName   command-    Used by "SaveIAR" (the avatar whose specific inventory to archive).</w:t>
       </w:r>
     </w:p>
     <w:p>
@@ -564,34 +266,15 @@
         <w:spacing w:line="240" w:lineRule="auto"/>
       </w:pPr>
       <w:r>
-        <w:t xml:space="preserve">Every command runs through </w:t>
-      </w:r>
-      <w:proofErr w:type="spellStart"/>
-      <w:r>
-        <w:t>CheckPerms</w:t>
-      </w:r>
-      <w:proofErr w:type="spellEnd"/>
-      <w:r>
-        <w:t>(avatar, password), which grants one of these permission levels:</w:t>
-      </w:r>
-    </w:p>
-    <w:p>
-      <w:pPr>
-        <w:spacing w:line="240" w:lineRule="auto"/>
-      </w:pPr>
-      <w:r>
-        <w:t xml:space="preserve">    1000  password exactly matches the grid's </w:t>
-      </w:r>
-      <w:proofErr w:type="spellStart"/>
-      <w:r>
-        <w:t>MachineHash</w:t>
-      </w:r>
-      <w:proofErr w:type="spellEnd"/>
-      <w:r>
-        <w:t xml:space="preserve"> </w:t>
-      </w:r>
-      <w:r>
-        <w:t xml:space="preserve"> (full admin - can do anything)</w:t>
+        <w:t xml:space="preserve">Every command runs through CheckPerms(avatar, password), which grants one of these permission levels:</w:t>
+      </w:r>
+    </w:p>
+    <w:p>
+      <w:pPr>
+        <w:spacing w:line="240" w:lineRule="auto"/>
+      </w:pPr>
+      <w:r>
+        <w:t xml:space="preserve">    1000  password exactly matches the grid's MachineHash  (full admin - can do anything)</w:t>
       </w:r>
     </w:p>
     <w:p>
@@ -600,19 +283,7 @@
         <w:ind w:left="1170" w:hanging="1170"/>
       </w:pPr>
       <w:r>
-        <w:t xml:space="preserve">    0-200  password matches the named avatar's login password;</w:t>
-      </w:r>
-      <w:r>
-        <w:t xml:space="preserve"> </w:t>
-      </w:r>
-      <w:r>
-        <w:t xml:space="preserve"> the avatar's user level in the grid becomes the</w:t>
-      </w:r>
-      <w:r>
-        <w:t xml:space="preserve"> </w:t>
-      </w:r>
-      <w:r>
-        <w:t>permission level (100 = Wifi admin, 200 = "Level God")</w:t>
+        <w:t xml:space="preserve">    0-200  password matches the named avatar's login password;  the avatar's user level in the grid becomes the permission level (100 = Wifi admin, 200 = "Level God")</w:t>
       </w:r>
     </w:p>
     <w:p>
@@ -636,23 +307,7 @@
         <w:spacing w:line="240" w:lineRule="auto"/>
       </w:pPr>
       <w:r>
-        <w:t xml:space="preserve">The </w:t>
-      </w:r>
-      <w:proofErr w:type="spellStart"/>
-      <w:r>
-        <w:t>MachineHash</w:t>
-      </w:r>
-      <w:proofErr w:type="spellEnd"/>
-      <w:r>
-        <w:t xml:space="preserve"> is stored in OutworldzFiles\Settings.ini (key: </w:t>
-      </w:r>
-      <w:proofErr w:type="spellStart"/>
-      <w:r>
-        <w:t>MachineHash</w:t>
-      </w:r>
-      <w:proofErr w:type="spellEnd"/>
-      <w:r>
-        <w:t>) - it is the MD5 of the grid's Dyn DNS password.</w:t>
+        <w:t xml:space="preserve">The MachineHash is stored in OutworldzFiles\Settings.ini (key: MachineHash) - it is the MD5 of the grid's Dyn DNS password.</w:t>
       </w:r>
     </w:p>
     <w:p>
@@ -691,13 +346,8 @@
       <w:pPr>
         <w:spacing w:line="240" w:lineRule="auto"/>
       </w:pPr>
-      <w:proofErr w:type="spellStart"/>
-      <w:r>
-        <w:t>StartDreamGrid</w:t>
-      </w:r>
-      <w:proofErr w:type="spellEnd"/>
-      <w:r>
-        <w:t xml:space="preserve">   (level &gt;= 200)</w:t>
+      <w:r>
+        <w:t xml:space="preserve">StartDreamGrid   (level &gt;= 200)</w:t>
       </w:r>
     </w:p>
     <w:p>
@@ -720,13 +370,8 @@
       <w:pPr>
         <w:spacing w:line="240" w:lineRule="auto"/>
       </w:pPr>
-      <w:proofErr w:type="spellStart"/>
-      <w:r>
-        <w:t>StopDreamGrid</w:t>
-      </w:r>
-      <w:proofErr w:type="spellEnd"/>
-      <w:r>
-        <w:t xml:space="preserve">    (level &gt; 200)</w:t>
+      <w:r>
+        <w:t xml:space="preserve">StopDreamGrid    (level &gt; 200)</w:t>
       </w:r>
     </w:p>
     <w:p>
@@ -749,13 +394,8 @@
       <w:pPr>
         <w:spacing w:line="240" w:lineRule="auto"/>
       </w:pPr>
-      <w:proofErr w:type="spellStart"/>
-      <w:r>
-        <w:t>RestartAll</w:t>
-      </w:r>
-      <w:proofErr w:type="spellEnd"/>
-      <w:r>
-        <w:t xml:space="preserve">       (level &gt;= 200)</w:t>
+      <w:r>
+        <w:t xml:space="preserve">RestartAll       (level &gt;= 200)</w:t>
       </w:r>
     </w:p>
     <w:p>
@@ -802,13 +442,8 @@
       <w:pPr>
         <w:spacing w:line="240" w:lineRule="auto"/>
       </w:pPr>
-      <w:proofErr w:type="spellStart"/>
-      <w:r>
-        <w:t>StartMysql</w:t>
-      </w:r>
-      <w:proofErr w:type="spellEnd"/>
-      <w:r>
-        <w:t xml:space="preserve">       (level &gt;= 200)</w:t>
+      <w:r>
+        <w:t xml:space="preserve">StartMysql       (level &gt;= 200)</w:t>
       </w:r>
     </w:p>
     <w:p>
@@ -823,14 +458,9 @@
       <w:pPr>
         <w:spacing w:line="240" w:lineRule="auto"/>
       </w:pPr>
-      <w:proofErr w:type="spellStart"/>
       <w:r>
         <w:lastRenderedPageBreak/>
-        <w:t>StopMysql</w:t>
-      </w:r>
-      <w:proofErr w:type="spellEnd"/>
-      <w:r>
-        <w:t xml:space="preserve">        (level &gt;= 200)</w:t>
+        <w:t xml:space="preserve">StopMysql        (level &gt;= 200)</w:t>
       </w:r>
     </w:p>
     <w:p>
@@ -861,13 +491,8 @@
       <w:pPr>
         <w:spacing w:line="240" w:lineRule="auto"/>
       </w:pPr>
-      <w:proofErr w:type="spellStart"/>
-      <w:r>
-        <w:t>StartRobust</w:t>
-      </w:r>
-      <w:proofErr w:type="spellEnd"/>
-      <w:r>
-        <w:t xml:space="preserve">      (level &gt; 0)</w:t>
+      <w:r>
+        <w:t xml:space="preserve">StartRobust      (level &gt; 0)</w:t>
       </w:r>
     </w:p>
     <w:p>
@@ -882,13 +507,8 @@
       <w:pPr>
         <w:spacing w:line="240" w:lineRule="auto"/>
       </w:pPr>
-      <w:proofErr w:type="spellStart"/>
-      <w:r>
-        <w:t>StopRobust</w:t>
-      </w:r>
-      <w:proofErr w:type="spellEnd"/>
-      <w:r>
-        <w:t xml:space="preserve">       (level &gt; 200)</w:t>
+      <w:r>
+        <w:t xml:space="preserve">StopRobust       (level &gt; 200)</w:t>
       </w:r>
     </w:p>
     <w:p>
@@ -911,21 +531,8 @@
       <w:pPr>
         <w:spacing w:line="240" w:lineRule="auto"/>
       </w:pPr>
-      <w:proofErr w:type="spellStart"/>
-      <w:r>
-        <w:t>StartApache</w:t>
-      </w:r>
-      <w:proofErr w:type="spellEnd"/>
-      <w:r>
-        <w:t xml:space="preserve">      (level = 1000, </w:t>
-      </w:r>
-      <w:proofErr w:type="spellStart"/>
-      <w:r>
-        <w:t>MachineHash</w:t>
-      </w:r>
-      <w:proofErr w:type="spellEnd"/>
-      <w:r>
-        <w:t xml:space="preserve"> only)</w:t>
+      <w:r>
+        <w:t xml:space="preserve">StartApache      (level = 1000, MachineHash only)</w:t>
       </w:r>
     </w:p>
     <w:p>
@@ -940,21 +547,8 @@
       <w:pPr>
         <w:spacing w:line="240" w:lineRule="auto"/>
       </w:pPr>
-      <w:proofErr w:type="spellStart"/>
-      <w:r>
-        <w:t>StopApache</w:t>
-      </w:r>
-      <w:proofErr w:type="spellEnd"/>
-      <w:r>
-        <w:t xml:space="preserve">       (level = 1000, </w:t>
-      </w:r>
-      <w:proofErr w:type="spellStart"/>
-      <w:r>
-        <w:t>MachineHash</w:t>
-      </w:r>
-      <w:proofErr w:type="spellEnd"/>
-      <w:r>
-        <w:t xml:space="preserve"> only)</w:t>
+      <w:r>
+        <w:t xml:space="preserve">StopApache       (level = 1000, MachineHash only)</w:t>
       </w:r>
     </w:p>
     <w:p>
@@ -977,13 +571,8 @@
       <w:pPr>
         <w:spacing w:line="240" w:lineRule="auto"/>
       </w:pPr>
-      <w:proofErr w:type="spellStart"/>
-      <w:r>
-        <w:t>StartIcecast</w:t>
-      </w:r>
-      <w:proofErr w:type="spellEnd"/>
-      <w:r>
-        <w:t xml:space="preserve">     (level &gt; 200)</w:t>
+      <w:r>
+        <w:t xml:space="preserve">StartIcecast     (level &gt; 200)</w:t>
       </w:r>
     </w:p>
     <w:p>
@@ -1003,13 +592,8 @@
       <w:pPr>
         <w:spacing w:line="240" w:lineRule="auto"/>
       </w:pPr>
-      <w:proofErr w:type="spellStart"/>
-      <w:r>
-        <w:t>StopIcecast</w:t>
-      </w:r>
-      <w:proofErr w:type="spellEnd"/>
-      <w:r>
-        <w:t xml:space="preserve">      (level &gt; 200)</w:t>
+      <w:r>
+        <w:t xml:space="preserve">StopIcecast      (level &gt; 200)</w:t>
       </w:r>
     </w:p>
     <w:p>
@@ -1046,37 +630,16 @@
       <w:pPr>
         <w:spacing w:line="240" w:lineRule="auto"/>
       </w:pPr>
-      <w:proofErr w:type="spellStart"/>
-      <w:r>
-        <w:t>StartRegion</w:t>
-      </w:r>
-      <w:proofErr w:type="spellEnd"/>
-      <w:r>
-        <w:t xml:space="preserve">      (level &gt; 1)</w:t>
-      </w:r>
-    </w:p>
-    <w:p>
-      <w:pPr>
-        <w:spacing w:line="240" w:lineRule="auto"/>
-      </w:pPr>
-      <w:r>
-        <w:t xml:space="preserve">    Boots </w:t>
-      </w:r>
-      <w:proofErr w:type="spellStart"/>
-      <w:r>
-        <w:t>RegionUUID</w:t>
-      </w:r>
-      <w:proofErr w:type="spellEnd"/>
-      <w:r>
-        <w:t xml:space="preserve"> or </w:t>
-      </w:r>
-      <w:proofErr w:type="spellStart"/>
-      <w:r>
-        <w:t>RegionName</w:t>
-      </w:r>
-      <w:proofErr w:type="spellEnd"/>
-      <w:r>
-        <w:t xml:space="preserve"> if not already running.</w:t>
+      <w:r>
+        <w:t xml:space="preserve">StartRegion      (level &gt; 1)</w:t>
+      </w:r>
+    </w:p>
+    <w:p>
+      <w:pPr>
+        <w:spacing w:line="240" w:lineRule="auto"/>
+      </w:pPr>
+      <w:r>
+        <w:t xml:space="preserve">    Boots RegionUUID or RegionName if not already running.</w:t>
       </w:r>
     </w:p>
     <w:p>
@@ -1096,13 +659,8 @@
       <w:pPr>
         <w:spacing w:line="240" w:lineRule="auto"/>
       </w:pPr>
-      <w:proofErr w:type="spellStart"/>
-      <w:r>
-        <w:t>StopRegion</w:t>
-      </w:r>
-      <w:proofErr w:type="spellEnd"/>
-      <w:r>
-        <w:t xml:space="preserve">       (level &gt; 1)</w:t>
+      <w:r>
+        <w:t xml:space="preserve">StopRegion       (level &gt; 1)</w:t>
       </w:r>
     </w:p>
     <w:p>
@@ -1130,13 +688,8 @@
       <w:pPr>
         <w:spacing w:line="240" w:lineRule="auto"/>
       </w:pPr>
-      <w:proofErr w:type="spellStart"/>
-      <w:r>
-        <w:t>RestartRegion</w:t>
-      </w:r>
-      <w:proofErr w:type="spellEnd"/>
-      <w:r>
-        <w:t xml:space="preserve">    (level &gt; 1)</w:t>
+      <w:r>
+        <w:t xml:space="preserve">RestartRegion    (level &gt; 1)</w:t>
       </w:r>
     </w:p>
     <w:p>
@@ -1174,31 +727,15 @@
         <w:spacing w:line="240" w:lineRule="auto"/>
       </w:pPr>
       <w:r>
-        <w:t xml:space="preserve">    Suspends a region in place (see Help\</w:t>
-      </w:r>
-      <w:proofErr w:type="spellStart"/>
-      <w:r>
-        <w:t>MCP.txt's</w:t>
-      </w:r>
-      <w:proofErr w:type="spellEnd"/>
-      <w:r>
-        <w:t xml:space="preserve"> note on the</w:t>
-      </w:r>
-    </w:p>
-    <w:p>
-      <w:pPr>
-        <w:spacing w:line="240" w:lineRule="auto"/>
-      </w:pPr>
-      <w:r>
-        <w:t xml:space="preserve">    hourly </w:t>
-      </w:r>
-      <w:proofErr w:type="spellStart"/>
-      <w:r>
-        <w:t>SmartStart</w:t>
-      </w:r>
-      <w:proofErr w:type="spellEnd"/>
-      <w:r>
-        <w:t xml:space="preserve"> freeze/thaw cycle - this is the same</w:t>
+        <w:t xml:space="preserve">    Suspends a region in place (see Help\MCP.txt's note on the</w:t>
+      </w:r>
+    </w:p>
+    <w:p>
+      <w:pPr>
+        <w:spacing w:line="240" w:lineRule="auto"/>
+      </w:pPr>
+      <w:r>
+        <w:t xml:space="preserve">    hourly SmartStart freeze/thaw cycle - this is the same</w:t>
       </w:r>
     </w:p>
     <w:p>
@@ -1284,13 +821,8 @@
       <w:pPr>
         <w:spacing w:line="240" w:lineRule="auto"/>
       </w:pPr>
-      <w:proofErr w:type="spellStart"/>
-      <w:r>
-        <w:t>SetStatus</w:t>
-      </w:r>
-      <w:proofErr w:type="spellEnd"/>
-      <w:r>
-        <w:t xml:space="preserve">        (level &gt; 200)</w:t>
+      <w:r>
+        <w:t xml:space="preserve">SetStatus        (level &gt; 200)</w:t>
       </w:r>
     </w:p>
     <w:p>
@@ -1306,39 +838,15 @@
         <w:spacing w:line="240" w:lineRule="auto"/>
       </w:pPr>
       <w:r>
-        <w:t xml:space="preserve">    Note: unlike the other region commands, </w:t>
-      </w:r>
-      <w:proofErr w:type="spellStart"/>
-      <w:r>
-        <w:t>SetStatus</w:t>
-      </w:r>
-      <w:proofErr w:type="spellEnd"/>
-      <w:r>
-        <w:t xml:space="preserve"> reads</w:t>
-      </w:r>
-    </w:p>
-    <w:p>
-      <w:pPr>
-        <w:spacing w:line="240" w:lineRule="auto"/>
-      </w:pPr>
-      <w:r>
-        <w:t xml:space="preserve">    </w:t>
-      </w:r>
-      <w:proofErr w:type="spellStart"/>
-      <w:r>
-        <w:t>RegionUUID</w:t>
-      </w:r>
-      <w:proofErr w:type="spellEnd"/>
-      <w:r>
-        <w:t xml:space="preserve"> only - it does not fall back to </w:t>
-      </w:r>
-      <w:proofErr w:type="spellStart"/>
-      <w:r>
-        <w:t>RegionName</w:t>
-      </w:r>
-      <w:proofErr w:type="spellEnd"/>
-      <w:r>
-        <w:t>.</w:t>
+        <w:t xml:space="preserve">    Note: unlike the other region commands, SetStatus reads</w:t>
+      </w:r>
+    </w:p>
+    <w:p>
+      <w:pPr>
+        <w:spacing w:line="240" w:lineRule="auto"/>
+      </w:pPr>
+      <w:r>
+        <w:t xml:space="preserve">    RegionUUID only - it does not fall back to RegionName.</w:t>
       </w:r>
     </w:p>
     <w:p>
@@ -1358,13 +866,8 @@
       <w:pPr>
         <w:spacing w:line="240" w:lineRule="auto"/>
       </w:pPr>
-      <w:proofErr w:type="spellStart"/>
-      <w:r>
-        <w:t>RegionStatus</w:t>
-      </w:r>
-      <w:proofErr w:type="spellEnd"/>
-      <w:r>
-        <w:t xml:space="preserve">     (no password required)</w:t>
+      <w:r>
+        <w:t xml:space="preserve">RegionStatus     (no password required)</w:t>
       </w:r>
     </w:p>
     <w:p>
@@ -1380,15 +883,7 @@
         <w:spacing w:line="240" w:lineRule="auto"/>
       </w:pPr>
       <w:r>
-        <w:t xml:space="preserve">    Suspended, Stopped, </w:t>
-      </w:r>
-      <w:proofErr w:type="spellStart"/>
-      <w:r>
-        <w:t>RecyclingDown</w:t>
-      </w:r>
-      <w:proofErr w:type="spellEnd"/>
-      <w:r>
-        <w:t>, Booting, Error, Restart,</w:t>
+        <w:t xml:space="preserve">    Suspended, Stopped, RecyclingDown, Booting, Error, Restart,</w:t>
       </w:r>
     </w:p>
     <w:p>
@@ -1453,13 +948,8 @@
       <w:pPr>
         <w:spacing w:line="240" w:lineRule="auto"/>
       </w:pPr>
-      <w:proofErr w:type="spellStart"/>
-      <w:r>
-        <w:t>SaveOAR</w:t>
-      </w:r>
-      <w:proofErr w:type="spellEnd"/>
-      <w:r>
-        <w:t xml:space="preserve">          (level &gt; 100)</w:t>
+      <w:r>
+        <w:t xml:space="preserve">SaveOAR          (level &gt; 100)</w:t>
       </w:r>
     </w:p>
     <w:p>
@@ -1482,18 +972,117 @@
       <w:pPr>
         <w:spacing w:line="240" w:lineRule="auto"/>
       </w:pPr>
-    </w:p>
-    <w:p>
-      <w:pPr>
-        <w:spacing w:line="240" w:lineRule="auto"/>
-      </w:pPr>
-      <w:proofErr w:type="spellStart"/>
-      <w:r>
-        <w:t>SaveIAR</w:t>
-      </w:r>
-      <w:proofErr w:type="spellEnd"/>
-      <w:r>
-        <w:t xml:space="preserve">          (level &gt;= 0, but also checks the avatar owns the</w:t>
+      <w:r>
+        <w:t xml:space="preserve">    Note: a regular avatar (not just level &gt; 100 admin) can also run</w:t>
+      </w:r>
+    </w:p>
+    <w:p>
+      <w:pPr>
+        <w:spacing w:line="240" w:lineRule="auto"/>
+      </w:pPr>
+      <w:r>
+        <w:t xml:space="preserve">    this for a region whose ESTATE THEY OWN - pass avatar/password for</w:t>
+      </w:r>
+    </w:p>
+    <w:p>
+      <w:pPr>
+        <w:spacing w:line="240" w:lineRule="auto"/>
+      </w:pPr>
+      <w:r>
+        <w:t xml:space="preserve">    that avatar instead of the MachineHash. Ownership is checked fresh</w:t>
+      </w:r>
+    </w:p>
+    <w:p>
+      <w:pPr>
+        <w:spacing w:line="240" w:lineRule="auto"/>
+      </w:pPr>
+      <w:r>
+        <w:t xml:space="preserve">    against estate_settings/estate_map, not any cached value.</w:t>
+      </w:r>
+    </w:p>
+    <w:p>
+      <w:pPr>
+        <w:spacing w:line="240" w:lineRule="auto"/>
+      </w:pPr>
+      <w:r>
+        <w:t xml:space="preserve">    Once the save completes, the finished .oar is automatically moved</w:t>
+      </w:r>
+    </w:p>
+    <w:p>
+      <w:pPr>
+        <w:spacing w:line="240" w:lineRule="auto"/>
+      </w:pPr>
+      <w:r>
+        <w:t xml:space="preserve">    to OutworldzFiles\Apache\htdocs\API\OAR\{guid}\ and served by</w:t>
+      </w:r>
+    </w:p>
+    <w:p>
+      <w:pPr>
+        <w:spacing w:line="240" w:lineRule="auto"/>
+      </w:pPr>
+      <w:r>
+        <w:t xml:space="preserve">    Apache as a plain download - but ONLY for a self-service (estate-</w:t>
+      </w:r>
+    </w:p>
+    <w:p>
+      <w:pPr>
+        <w:spacing w:line="240" w:lineRule="auto"/>
+      </w:pPr>
+      <w:r>
+        <w:t xml:space="preserve">    owner) save; an admin-triggered or automated save is not delivered</w:t>
+      </w:r>
+    </w:p>
+    <w:p>
+      <w:pPr>
+        <w:spacing w:line="240" w:lineRule="auto"/>
+      </w:pPr>
+      <w:r>
+        <w:t xml:space="preserve">    this way. If Settings.EmailEnabled and the avatar has a valid email</w:t>
+      </w:r>
+    </w:p>
+    <w:p>
+      <w:pPr>
+        <w:spacing w:line="240" w:lineRule="auto"/>
+      </w:pPr>
+      <w:r>
+        <w:t xml:space="preserve">    on file, the download link is emailed automatically. The link</w:t>
+      </w:r>
+    </w:p>
+    <w:p>
+      <w:pPr>
+        <w:spacing w:line="240" w:lineRule="auto"/>
+      </w:pPr>
+      <w:r>
+        <w:t xml:space="preserve">    expires after Settings.DownloadLinkExpiryHours (default 24) and is</w:t>
+      </w:r>
+    </w:p>
+    <w:p>
+      <w:pPr>
+        <w:spacing w:line="240" w:lineRule="auto"/>
+      </w:pPr>
+      <w:r>
+        <w:t xml:space="preserve">    then deleted. Poll DownloadStatus (below) with Kind=OAR to find out</w:t>
+      </w:r>
+    </w:p>
+    <w:p>
+      <w:pPr>
+        <w:spacing w:line="240" w:lineRule="auto"/>
+      </w:pPr>
+      <w:r>
+        <w:t xml:space="preserve">    when the file is ready and get the URL.</w:t>
+      </w:r>
+    </w:p>
+    <w:p>
+      <w:pPr>
+        <w:spacing w:line="240" w:lineRule="auto"/>
+      </w:pPr>
+    </w:p>
+    <w:p>
+      <w:pPr>
+        <w:spacing w:line="240" w:lineRule="auto"/>
+      </w:pPr>
+      <w:r>
+        <w:t xml:space="preserve">SaveIAR          (level &gt;= 0, but also checks the avatar owns the</w:t>
       </w:r>
     </w:p>
     <w:p>
@@ -1541,39 +1130,143 @@
         <w:spacing w:line="240" w:lineRule="auto"/>
       </w:pPr>
       <w:r>
-        <w:t xml:space="preserve">    Note: the current source only saves the file server-side (no</w:t>
-      </w:r>
-    </w:p>
-    <w:p>
-      <w:pPr>
-        <w:spacing w:line="240" w:lineRule="auto"/>
-      </w:pPr>
-      <w:r>
-        <w:t xml:space="preserve">    download link is produced yet - see the TODO comment in</w:t>
-      </w:r>
-    </w:p>
-    <w:p>
-      <w:pPr>
-        <w:spacing w:line="240" w:lineRule="auto"/>
-      </w:pPr>
-      <w:r>
-        <w:t xml:space="preserve">    </w:t>
-      </w:r>
-      <w:proofErr w:type="spellStart"/>
-      <w:r>
-        <w:t>CommandProcess's</w:t>
-      </w:r>
-      <w:proofErr w:type="spellEnd"/>
-      <w:r>
-        <w:t xml:space="preserve"> </w:t>
-      </w:r>
-      <w:proofErr w:type="spellStart"/>
-      <w:r>
-        <w:t>SaveIAR</w:t>
-      </w:r>
-      <w:proofErr w:type="spellEnd"/>
-      <w:r>
-        <w:t xml:space="preserve"> case).</w:t>
+        <w:t xml:space="preserve">    Once the save completes, the finished .iar is automatically moved to</w:t>
+      </w:r>
+    </w:p>
+    <w:p>
+      <w:pPr>
+        <w:spacing w:line="240" w:lineRule="auto"/>
+      </w:pPr>
+      <w:r>
+        <w:t xml:space="preserve">    OutworldzFiles\Apache\htdocs\API\IAR\{guid}\ (a freshly generated</w:t>
+      </w:r>
+    </w:p>
+    <w:p>
+      <w:pPr>
+        <w:spacing w:line="240" w:lineRule="auto"/>
+      </w:pPr>
+      <w:r>
+        <w:t xml:space="preserve">    GUID, never the avatar's own UUID) and served by Apache as a plain</w:t>
+      </w:r>
+    </w:p>
+    <w:p>
+      <w:pPr>
+        <w:spacing w:line="240" w:lineRule="auto"/>
+      </w:pPr>
+      <w:r>
+        <w:t xml:space="preserve">    download. If Settings.EmailEnabled and the avatar has a valid email</w:t>
+      </w:r>
+    </w:p>
+    <w:p>
+      <w:pPr>
+        <w:spacing w:line="240" w:lineRule="auto"/>
+      </w:pPr>
+      <w:r>
+        <w:t xml:space="preserve">    on file, the download link is emailed to them automatically. The</w:t>
+      </w:r>
+    </w:p>
+    <w:p>
+      <w:pPr>
+        <w:spacing w:line="240" w:lineRule="auto"/>
+      </w:pPr>
+      <w:r>
+        <w:t xml:space="preserve">    link expires after Settings.DownloadLinkExpiryHours (default 24)</w:t>
+      </w:r>
+    </w:p>
+    <w:p>
+      <w:pPr>
+        <w:spacing w:line="240" w:lineRule="auto"/>
+      </w:pPr>
+      <w:r>
+        <w:t xml:space="preserve">    and is then deleted. Poll DownloadStatus (below) with the same</w:t>
+      </w:r>
+    </w:p>
+    <w:p>
+      <w:pPr>
+        <w:spacing w:line="240" w:lineRule="auto"/>
+      </w:pPr>
+      <w:r>
+        <w:t xml:space="preserve">    AvatarName/password to find out when the file is ready and get the</w:t>
+      </w:r>
+    </w:p>
+    <w:p>
+      <w:pPr>
+        <w:spacing w:line="240" w:lineRule="auto"/>
+      </w:pPr>
+      <w:r>
+        <w:t xml:space="preserve">    URL - or just visit http://{PublicIP}:{ApachePort}/API/download.php</w:t>
+      </w:r>
+    </w:p>
+    <w:p>
+      <w:pPr>
+        <w:spacing w:line="240" w:lineRule="auto"/>
+      </w:pPr>
+      <w:r>
+        <w:t xml:space="preserve">    (?kind=IAR or ?kind=OAR), which does all of this for you with a</w:t>
+      </w:r>
+    </w:p>
+    <w:p>
+      <w:pPr>
+        <w:spacing w:line="240" w:lineRule="auto"/>
+      </w:pPr>
+      <w:r>
+        <w:t xml:space="preserve">    simple login form and no manual URL-building needed.</w:t>
+      </w:r>
+    </w:p>
+    <w:p>
+      <w:pPr>
+        <w:spacing w:line="240" w:lineRule="auto"/>
+      </w:pPr>
+      <w:r>
+        <w:t xml:space="preserve">DownloadStatus   (level &gt;= 0, but also checks the avatar owns the</w:t>
+      </w:r>
+    </w:p>
+    <w:p>
+      <w:pPr>
+        <w:spacing w:line="240" w:lineRule="auto"/>
+      </w:pPr>
+      <w:r>
+        <w:t xml:space="preserve">                  named download - same check as SaveIAR)</w:t>
+      </w:r>
+    </w:p>
+    <w:p>
+      <w:pPr>
+        <w:spacing w:line="240" w:lineRule="auto"/>
+      </w:pPr>
+      <w:r>
+        <w:t xml:space="preserve">    Polls whether a previously requested IAR/OAR download is ready yet.</w:t>
+      </w:r>
+    </w:p>
+    <w:p>
+      <w:pPr>
+        <w:spacing w:line="240" w:lineRule="auto"/>
+      </w:pPr>
+      <w:r>
+        <w:t xml:space="preserve">    Returns JSON: {"ready":false} while still processing, or once ready:</w:t>
+      </w:r>
+    </w:p>
+    <w:p>
+      <w:pPr>
+        <w:spacing w:line="240" w:lineRule="auto"/>
+      </w:pPr>
+      <w:r>
+        <w:t xml:space="preserve">    {"ready":true,"url":"...","expiresUtc":"..."}</w:t>
+      </w:r>
+    </w:p>
+    <w:p>
+      <w:pPr>
+        <w:spacing w:line="240" w:lineRule="auto"/>
+      </w:pPr>
+      <w:r>
+        <w:t xml:space="preserve">    http://127.0.0.1:8001/?command=DownloadStatus&amp;password={HASH}&amp;AvatarName=First%20Last&amp;Kind=IAR</w:t>
+      </w:r>
+    </w:p>
+    <w:p>
+      <w:pPr>
+        <w:spacing w:line="240" w:lineRule="auto"/>
+      </w:pPr>
+      <w:r>
+        <w:t xml:space="preserve">    Kind must be IAR or OAR.</w:t>
       </w:r>
     </w:p>
     <w:p>
@@ -1586,6 +1279,134 @@
         <w:pStyle w:val="Heading2"/>
       </w:pPr>
       <w:r>
+        <w:t>WEB DOWNLOAD PAGES (browser, not raw API calls)</w:t>
+      </w:r>
+    </w:p>
+    <w:p>
+      <w:pPr>
+        <w:spacing w:line="240" w:lineRule="auto"/>
+      </w:pPr>
+      <w:r>
+        <w:t xml:space="preserve">http://{PublicIP}:{ApachePort}/API/download.php?kind=IAR</w:t>
+      </w:r>
+    </w:p>
+    <w:p>
+      <w:pPr>
+        <w:spacing w:line="240" w:lineRule="auto"/>
+      </w:pPr>
+      <w:r>
+        <w:t xml:space="preserve">http://{PublicIP}:{ApachePort}/API/download.php?kind=OAR</w:t>
+      </w:r>
+    </w:p>
+    <w:p>
+      <w:pPr>
+        <w:spacing w:line="240" w:lineRule="auto"/>
+      </w:pPr>
+      <w:r>
+        <w:t xml:space="preserve">A simple self-service page: the avatar logs in with their own name and</w:t>
+      </w:r>
+    </w:p>
+    <w:p>
+      <w:pPr>
+        <w:spacing w:line="240" w:lineRule="auto"/>
+      </w:pPr>
+      <w:r>
+        <w:t xml:space="preserve">password (never stored server-side), clicks a button to save their own</w:t>
+      </w:r>
+    </w:p>
+    <w:p>
+      <w:pPr>
+        <w:spacing w:line="240" w:lineRule="auto"/>
+      </w:pPr>
+      <w:r>
+        <w:t xml:space="preserve">IAR (or, for OAR, their own estate's region), and the page polls</w:t>
+      </w:r>
+    </w:p>
+    <w:p>
+      <w:pPr>
+        <w:spacing w:line="240" w:lineRule="auto"/>
+      </w:pPr>
+      <w:r>
+        <w:t xml:space="preserve">automatically until the file is ready, showing a working download link</w:t>
+      </w:r>
+    </w:p>
+    <w:p>
+      <w:pPr>
+        <w:spacing w:line="240" w:lineRule="auto"/>
+      </w:pPr>
+      <w:r>
+        <w:t xml:space="preserve">with no page reload needed. This is the same SaveIAR/SaveOAR/</w:t>
+      </w:r>
+    </w:p>
+    <w:p>
+      <w:pPr>
+        <w:spacing w:line="240" w:lineRule="auto"/>
+      </w:pPr>
+      <w:r>
+        <w:t xml:space="preserve">DownloadStatus API described above, wrapped in a form so nobody has to</w:t>
+      </w:r>
+    </w:p>
+    <w:p>
+      <w:pPr>
+        <w:spacing w:line="240" w:lineRule="auto"/>
+      </w:pPr>
+      <w:r>
+        <w:t xml:space="preserve">hand-build URLs.</w:t>
+      </w:r>
+    </w:p>
+    <w:p>
+      <w:pPr>
+        <w:spacing w:line="240" w:lineRule="auto"/>
+      </w:pPr>
+      <w:r>
+        <w:t xml:space="preserve">A link that has expired (or never existed) shows a friendly</w:t>
+      </w:r>
+    </w:p>
+    <w:p>
+      <w:pPr>
+        <w:spacing w:line="240" w:lineRule="auto"/>
+      </w:pPr>
+      <w:r>
+        <w:t xml:space="preserve">"This link has expired" page (/API/expired.html) with a link back to</w:t>
+      </w:r>
+    </w:p>
+    <w:p>
+      <w:pPr>
+        <w:spacing w:line="240" w:lineRule="auto"/>
+      </w:pPr>
+      <w:r>
+        <w:t xml:space="preserve">request a new download, instead of a bare 404.</w:t>
+      </w:r>
+    </w:p>
+    <w:p>
+      <w:pPr>
+        <w:spacing w:line="240" w:lineRule="auto"/>
+      </w:pPr>
+      <w:r>
+        <w:t xml:space="preserve">The main admin dashboard (/API/Index.php) also has "Download IAR"/</w:t>
+      </w:r>
+    </w:p>
+    <w:p>
+      <w:pPr>
+        <w:spacing w:line="240" w:lineRule="auto"/>
+      </w:pPr>
+      <w:r>
+        <w:t xml:space="preserve">"Download OAR" buttons that link straight to this page.</w:t>
+      </w:r>
+    </w:p>
+    <w:p>
+      <w:pPr>
+        <w:spacing w:line="240" w:lineRule="auto"/>
+      </w:pPr>
+      <w:r>
+        <w:t xml:space="preserve"/>
+      </w:r>
+    </w:p>
+    <w:p>
+      <w:pPr>
+        <w:pStyle w:val="Heading2"/>
+      </w:pPr>
+      <w:r>
         <w:t>Login check</w:t>
       </w:r>
     </w:p>
@@ -1678,15 +1499,7 @@
         <w:spacing w:line="240" w:lineRule="auto"/>
       </w:pPr>
       <w:r>
-        <w:t xml:space="preserve">name, status, RAM usage, prim count, estate, </w:t>
-      </w:r>
-      <w:proofErr w:type="spellStart"/>
-      <w:r>
-        <w:t>SmartStart</w:t>
-      </w:r>
-      <w:proofErr w:type="spellEnd"/>
-      <w:r>
-        <w:t xml:space="preserve"> mode, and a</w:t>
+        <w:t xml:space="preserve">name, status, RAM usage, prim count, estate, SmartStart mode, and a</w:t>
       </w:r>
     </w:p>
     <w:p>
@@ -1724,15 +1537,7 @@
         <w:spacing w:line="240" w:lineRule="auto"/>
       </w:pPr>
       <w:r>
-        <w:t xml:space="preserve">    </w:t>
-      </w:r>
-      <w:proofErr w:type="spellStart"/>
-      <w:r>
-        <w:t>rp</w:t>
-      </w:r>
-      <w:proofErr w:type="spellEnd"/>
-      <w:r>
-        <w:t xml:space="preserve">          rows per page, default 100.</w:t>
+        <w:t xml:space="preserve">    rp          rows per page, default 100.</w:t>
       </w:r>
     </w:p>
     <w:p>
@@ -1748,47 +1553,15 @@
         <w:spacing w:line="240" w:lineRule="auto"/>
       </w:pPr>
       <w:r>
-        <w:t xml:space="preserve">    </w:t>
-      </w:r>
-      <w:proofErr w:type="spellStart"/>
-      <w:r>
-        <w:t>qtype</w:t>
-      </w:r>
-      <w:proofErr w:type="spellEnd"/>
-      <w:r>
-        <w:t xml:space="preserve">       set to "</w:t>
-      </w:r>
-      <w:proofErr w:type="spellStart"/>
-      <w:r>
-        <w:t>RegionName</w:t>
-      </w:r>
-      <w:proofErr w:type="spellEnd"/>
-      <w:r>
-        <w:t>" when using "query".</w:t>
-      </w:r>
-    </w:p>
-    <w:p>
-      <w:pPr>
-        <w:spacing w:line="240" w:lineRule="auto"/>
-      </w:pPr>
-      <w:r>
-        <w:t xml:space="preserve">    </w:t>
-      </w:r>
-      <w:proofErr w:type="spellStart"/>
-      <w:r>
-        <w:t>sortorder</w:t>
-      </w:r>
-      <w:proofErr w:type="spellEnd"/>
-      <w:r>
-        <w:t xml:space="preserve">   "</w:t>
-      </w:r>
-      <w:proofErr w:type="spellStart"/>
-      <w:r>
-        <w:t>asc</w:t>
-      </w:r>
-      <w:proofErr w:type="spellEnd"/>
-      <w:r>
-        <w:t>" or "desc" (region name), default "desc".</w:t>
+        <w:t xml:space="preserve">    qtype       set to "RegionName" when using "query".</w:t>
+      </w:r>
+    </w:p>
+    <w:p>
+      <w:pPr>
+        <w:spacing w:line="240" w:lineRule="auto"/>
+      </w:pPr>
+      <w:r>
+        <w:t xml:space="preserve">    sortorder   "asc" or "desc" (region name), default "desc".</w:t>
       </w:r>
     </w:p>
     <w:p>
@@ -1822,79 +1595,7 @@
         <w:spacing w:line="240" w:lineRule="auto"/>
       </w:pPr>
       <w:r>
-        <w:t>NOTE ON THE OLD DOC: the previous API.docx documented a different "</w:t>
-      </w:r>
-      <w:proofErr w:type="spellStart"/>
-      <w:r>
-        <w:t>RegionList</w:t>
-      </w:r>
-      <w:proofErr w:type="spellEnd"/>
-      <w:r>
-        <w:t>" command that dumped raw internal region properties (_</w:t>
-      </w:r>
-      <w:proofErr w:type="spellStart"/>
-      <w:r>
-        <w:t>PrimCount</w:t>
-      </w:r>
-      <w:proofErr w:type="spellEnd"/>
-      <w:r>
-        <w:t>, _</w:t>
-      </w:r>
-      <w:proofErr w:type="spellStart"/>
-      <w:r>
-        <w:t>FilePath</w:t>
-      </w:r>
-      <w:proofErr w:type="spellEnd"/>
-      <w:r>
-        <w:t>, _</w:t>
-      </w:r>
-      <w:proofErr w:type="spellStart"/>
-      <w:r>
-        <w:t>RegionPid</w:t>
-      </w:r>
-      <w:proofErr w:type="spellEnd"/>
-      <w:r>
-        <w:t>, etc.) as one giant JSON object keyed by region UUID. That command class constant still exists in the source (</w:t>
-      </w:r>
-      <w:proofErr w:type="spellStart"/>
-      <w:r>
-        <w:t>CommandClass.RegionList</w:t>
-      </w:r>
-      <w:proofErr w:type="spellEnd"/>
-      <w:r>
-        <w:t>) but is only used internally, for the foreground DreamGrid UI to sync state from a background service instance (see Modules\</w:t>
-      </w:r>
-      <w:proofErr w:type="spellStart"/>
-      <w:r>
-        <w:t>Services.vb</w:t>
-      </w:r>
-      <w:proofErr w:type="spellEnd"/>
-      <w:r>
-        <w:t xml:space="preserve">, </w:t>
-      </w:r>
-      <w:proofErr w:type="spellStart"/>
-      <w:r>
-        <w:t>GetServiceList</w:t>
-      </w:r>
-      <w:proofErr w:type="spellEnd"/>
-      <w:r>
-        <w:t xml:space="preserve">) - it is not wired into the public </w:t>
-      </w:r>
-      <w:proofErr w:type="spellStart"/>
-      <w:r>
-        <w:t>CommandProcess</w:t>
-      </w:r>
-      <w:proofErr w:type="spellEnd"/>
-      <w:r>
-        <w:t xml:space="preserve"> dispatcher and is not a supported external command. Use ?command=</w:t>
-      </w:r>
-      <w:proofErr w:type="spellStart"/>
-      <w:r>
-        <w:t>regionlist</w:t>
-      </w:r>
-      <w:proofErr w:type="spellEnd"/>
-      <w:r>
-        <w:t xml:space="preserve"> (above) instead.</w:t>
+        <w:t xml:space="preserve">NOTE ON THE OLD DOC: the previous API.docx documented a different "RegionList" command that dumped raw internal region properties (_PrimCount, _FilePath, _RegionPid, etc.) as one giant JSON object keyed by region UUID. That command class constant still exists in the source (CommandClass.RegionList) but is only used internally, for the foreground DreamGrid UI to sync state from a background service instance (see Modules\Services.vb, GetServiceList) - it is not wired into the public CommandProcess dispatcher and is not a supported external command. Use ?command=regionlist (above) instead.</w:t>
       </w:r>
     </w:p>
     <w:p>
@@ -2206,15 +1907,7 @@
         </w:rPr>
       </w:pPr>
       <w:r>
-        <w:t>DreamGrid also exposes a "speak" / "</w:t>
-      </w:r>
-      <w:proofErr w:type="spellStart"/>
-      <w:r>
-        <w:t>speak_to_file</w:t>
-      </w:r>
-      <w:proofErr w:type="spellEnd"/>
-      <w:r>
-        <w:t>" pair of MCP tools that call this same speech engine directly (bypassing the APIKey check, since MCP has its own permission model) - see Help\MCP.txt.</w:t>
+        <w:t>DreamGrid also exposes a "speak" / "speak_to_file" pair of MCP tools that call this same speech engine directly (bypassing the APIKey check, since MCP has its own permission model) - see Help\MCP.txt.</w:t>
       </w:r>
     </w:p>
     <w:sectPr>

</xml_diff>

<commit_message>
Update API, Dreamgrid, Gloebit, WordPress manuals; add Paypal manual
Fred's own edits, committing on his behalf.

Co-Authored-By: Claude Sonnet 5 <noreply@anthropic.com>
</commit_message>
<xml_diff>
--- a/API.docx
+++ b/API.docx
@@ -24,15 +24,99 @@
         <w:spacing w:line="240" w:lineRule="auto"/>
       </w:pPr>
       <w:r>
-        <w:t>DreamGrid exposes a HTTP API on the diagnostics port (Settings-&gt; Network Ports; default 8001) for remote control, region listing,teleport signs, and text-to-speech. All of it is served by the samelistener - see Classes\ClassWebServer.vb - and dispatched byModules\Webserver.vb's ParsePost/CommandProcess functions.</w:t>
-      </w:r>
-    </w:p>
-    <w:p>
-      <w:pPr>
-        <w:spacing w:line="240" w:lineRule="auto"/>
-      </w:pPr>
-      <w:r>
-        <w:t>DreamGrid also exposes this same control surface as an MCP serverfor AI clients like Claude, at /mcp on</w:t>
+        <w:t xml:space="preserve">DreamGrid exposes </w:t>
+      </w:r>
+      <w:proofErr w:type="gramStart"/>
+      <w:r>
+        <w:t>a HTTP</w:t>
+      </w:r>
+      <w:proofErr w:type="gramEnd"/>
+      <w:r>
+        <w:t xml:space="preserve"> API on the diagnostics port (Settings-&gt; Network Ports; default 8001) for remote control, region </w:t>
+      </w:r>
+      <w:proofErr w:type="spellStart"/>
+      <w:r>
+        <w:t>listing,teleport</w:t>
+      </w:r>
+      <w:proofErr w:type="spellEnd"/>
+      <w:r>
+        <w:t xml:space="preserve"> signs, and text-to-speech. All of it is served by the </w:t>
+      </w:r>
+      <w:proofErr w:type="spellStart"/>
+      <w:proofErr w:type="gramStart"/>
+      <w:r>
+        <w:t>samelistener</w:t>
+      </w:r>
+      <w:proofErr w:type="spellEnd"/>
+      <w:proofErr w:type="gramEnd"/>
+      <w:r>
+        <w:t xml:space="preserve"> - see Classes\</w:t>
+      </w:r>
+      <w:proofErr w:type="spellStart"/>
+      <w:r>
+        <w:t>ClassWebServer.vb</w:t>
+      </w:r>
+      <w:proofErr w:type="spellEnd"/>
+      <w:r>
+        <w:t xml:space="preserve"> - and dispatched </w:t>
+      </w:r>
+      <w:proofErr w:type="spellStart"/>
+      <w:r>
+        <w:t>byModules</w:t>
+      </w:r>
+      <w:proofErr w:type="spellEnd"/>
+      <w:r>
+        <w:t>\</w:t>
+      </w:r>
+      <w:proofErr w:type="spellStart"/>
+      <w:r>
+        <w:t>Webserver.vb's</w:t>
+      </w:r>
+      <w:proofErr w:type="spellEnd"/>
+      <w:r>
+        <w:t xml:space="preserve"> </w:t>
+      </w:r>
+      <w:proofErr w:type="spellStart"/>
+      <w:r>
+        <w:t>ParsePost</w:t>
+      </w:r>
+      <w:proofErr w:type="spellEnd"/>
+      <w:r>
+        <w:t>/</w:t>
+      </w:r>
+      <w:proofErr w:type="spellStart"/>
+      <w:r>
+        <w:t>CommandProcess</w:t>
+      </w:r>
+      <w:proofErr w:type="spellEnd"/>
+      <w:r>
+        <w:t xml:space="preserve"> functions.</w:t>
+      </w:r>
+    </w:p>
+    <w:p>
+      <w:pPr>
+        <w:spacing w:line="240" w:lineRule="auto"/>
+      </w:pPr>
+      <w:r>
+        <w:t xml:space="preserve">DreamGrid also exposes this same control surface as an MCP </w:t>
+      </w:r>
+      <w:proofErr w:type="spellStart"/>
+      <w:proofErr w:type="gramStart"/>
+      <w:r>
+        <w:t>serverfor</w:t>
+      </w:r>
+      <w:proofErr w:type="spellEnd"/>
+      <w:proofErr w:type="gramEnd"/>
+      <w:r>
+        <w:t xml:space="preserve"> AI clients like Claude, at /</w:t>
+      </w:r>
+      <w:proofErr w:type="spellStart"/>
+      <w:r>
+        <w:t>mcp</w:t>
+      </w:r>
+      <w:proofErr w:type="spellEnd"/>
+      <w:r>
+        <w:t xml:space="preserve"> on</w:t>
       </w:r>
       <w:r>
         <w:t xml:space="preserve"> the Apache port.</w:t>
@@ -48,6 +132,767 @@
     </w:p>
     <w:p>
       <w:pPr>
+        <w:spacing w:line="240" w:lineRule="auto"/>
+      </w:pPr>
+      <w:r>
+        <w:t>Login is level 0</w:t>
+      </w:r>
+    </w:p>
+    <w:p>
+      <w:pPr>
+        <w:spacing w:line="240" w:lineRule="auto"/>
+      </w:pPr>
+      <w:r>
+        <w:t> </w:t>
+      </w:r>
+      <w:r>
+        <w:t> </w:t>
+      </w:r>
+      <w:r>
+        <w:t> </w:t>
+      </w:r>
+      <w:r>
+        <w:t> </w:t>
+      </w:r>
+      <w:r>
+        <w:t>They can log in.</w:t>
+      </w:r>
+    </w:p>
+    <w:p>
+      <w:pPr>
+        <w:spacing w:line="240" w:lineRule="auto"/>
+      </w:pPr>
+      <w:r>
+        <w:t> </w:t>
+      </w:r>
+      <w:r>
+        <w:t> </w:t>
+      </w:r>
+      <w:r>
+        <w:t> </w:t>
+      </w:r>
+      <w:r>
+        <w:t> </w:t>
+      </w:r>
+      <w:proofErr w:type="spellStart"/>
+      <w:r>
+        <w:t>DownloadStatus</w:t>
+      </w:r>
+      <w:proofErr w:type="spellEnd"/>
+      <w:r>
+        <w:t>  if their OAR/IAR is available. Oars must be the owner of, not estate admin.</w:t>
+      </w:r>
+    </w:p>
+    <w:p>
+      <w:pPr>
+        <w:spacing w:line="240" w:lineRule="auto"/>
+      </w:pPr>
+      <w:r>
+        <w:t> </w:t>
+      </w:r>
+      <w:r>
+        <w:t> </w:t>
+      </w:r>
+      <w:r>
+        <w:t> </w:t>
+      </w:r>
+      <w:r>
+        <w:t> </w:t>
+      </w:r>
+      <w:proofErr w:type="spellStart"/>
+      <w:r>
+        <w:t>RegionStatus</w:t>
+      </w:r>
+      <w:proofErr w:type="spellEnd"/>
+      <w:r>
+        <w:t xml:space="preserve">   can be seen Suspended, Stopped, </w:t>
+      </w:r>
+      <w:proofErr w:type="spellStart"/>
+      <w:r>
+        <w:t>RecyclingDown</w:t>
+      </w:r>
+      <w:proofErr w:type="spellEnd"/>
+      <w:r>
+        <w:t xml:space="preserve">, Booting, Error, </w:t>
+      </w:r>
+      <w:proofErr w:type="spellStart"/>
+      <w:r>
+        <w:t>Restart,etc</w:t>
+      </w:r>
+      <w:proofErr w:type="spellEnd"/>
+      <w:r>
+        <w:t>.</w:t>
+      </w:r>
+    </w:p>
+    <w:p>
+      <w:pPr>
+        <w:spacing w:line="240" w:lineRule="auto"/>
+      </w:pPr>
+    </w:p>
+    <w:p>
+      <w:pPr>
+        <w:spacing w:line="240" w:lineRule="auto"/>
+      </w:pPr>
+      <w:r>
+        <w:t>Diva level (approves users, can delete avatars) is 100</w:t>
+      </w:r>
+    </w:p>
+    <w:p>
+      <w:pPr>
+        <w:spacing w:line="240" w:lineRule="auto"/>
+      </w:pPr>
+      <w:r>
+        <w:t> </w:t>
+      </w:r>
+      <w:r>
+        <w:t> </w:t>
+      </w:r>
+      <w:r>
+        <w:t> </w:t>
+      </w:r>
+      <w:r>
+        <w:t> </w:t>
+      </w:r>
+      <w:proofErr w:type="spellStart"/>
+      <w:r>
+        <w:t>StartRobust</w:t>
+      </w:r>
+      <w:proofErr w:type="spellEnd"/>
+      <w:r>
+        <w:t>     </w:t>
+      </w:r>
+    </w:p>
+    <w:p>
+      <w:pPr>
+        <w:spacing w:line="240" w:lineRule="auto"/>
+      </w:pPr>
+      <w:r>
+        <w:t> </w:t>
+      </w:r>
+      <w:r>
+        <w:t> </w:t>
+      </w:r>
+      <w:r>
+        <w:t> </w:t>
+      </w:r>
+      <w:r>
+        <w:t> </w:t>
+      </w:r>
+      <w:r>
+        <w:t>Start a Region    </w:t>
+      </w:r>
+    </w:p>
+    <w:p>
+      <w:pPr>
+        <w:spacing w:line="240" w:lineRule="auto"/>
+      </w:pPr>
+      <w:r>
+        <w:t> </w:t>
+      </w:r>
+      <w:r>
+        <w:t> </w:t>
+      </w:r>
+      <w:r>
+        <w:t> </w:t>
+      </w:r>
+      <w:r>
+        <w:t> </w:t>
+      </w:r>
+      <w:r>
+        <w:t>Restart a region </w:t>
+      </w:r>
+    </w:p>
+    <w:p>
+      <w:pPr>
+        <w:spacing w:line="240" w:lineRule="auto"/>
+      </w:pPr>
+    </w:p>
+    <w:p>
+      <w:pPr>
+        <w:spacing w:line="240" w:lineRule="auto"/>
+      </w:pPr>
+      <w:r>
+        <w:t>Level Gods are 200</w:t>
+      </w:r>
+    </w:p>
+    <w:p>
+      <w:pPr>
+        <w:spacing w:line="240" w:lineRule="auto"/>
+      </w:pPr>
+      <w:r>
+        <w:t> </w:t>
+      </w:r>
+      <w:r>
+        <w:t> </w:t>
+      </w:r>
+      <w:r>
+        <w:t> </w:t>
+      </w:r>
+      <w:r>
+        <w:t> </w:t>
+      </w:r>
+      <w:proofErr w:type="spellStart"/>
+      <w:r>
+        <w:t>SaveOAR</w:t>
+      </w:r>
+      <w:proofErr w:type="spellEnd"/>
+    </w:p>
+    <w:p>
+      <w:pPr>
+        <w:spacing w:line="240" w:lineRule="auto"/>
+      </w:pPr>
+      <w:r>
+        <w:t> </w:t>
+      </w:r>
+      <w:r>
+        <w:t> </w:t>
+      </w:r>
+      <w:r>
+        <w:t> </w:t>
+      </w:r>
+      <w:r>
+        <w:t> </w:t>
+      </w:r>
+      <w:proofErr w:type="spellStart"/>
+      <w:r>
+        <w:t>SaveIAR</w:t>
+      </w:r>
+      <w:proofErr w:type="spellEnd"/>
+    </w:p>
+    <w:p>
+      <w:pPr>
+        <w:spacing w:line="240" w:lineRule="auto"/>
+      </w:pPr>
+      <w:r>
+        <w:t> </w:t>
+      </w:r>
+      <w:r>
+        <w:t> </w:t>
+      </w:r>
+      <w:r>
+        <w:t> </w:t>
+      </w:r>
+      <w:r>
+        <w:t> </w:t>
+      </w:r>
+      <w:r>
+        <w:t>Backup  the grid per the Global settings </w:t>
+      </w:r>
+    </w:p>
+    <w:p>
+      <w:pPr>
+        <w:spacing w:line="240" w:lineRule="auto"/>
+      </w:pPr>
+      <w:r>
+        <w:t> </w:t>
+      </w:r>
+      <w:r>
+        <w:t> </w:t>
+      </w:r>
+      <w:r>
+        <w:t> </w:t>
+      </w:r>
+      <w:r>
+        <w:t> </w:t>
+      </w:r>
+      <w:r>
+        <w:t>Restart DreamGrid  </w:t>
+      </w:r>
+    </w:p>
+    <w:p>
+      <w:pPr>
+        <w:spacing w:line="240" w:lineRule="auto"/>
+      </w:pPr>
+      <w:r>
+        <w:t> </w:t>
+      </w:r>
+      <w:r>
+        <w:t> </w:t>
+      </w:r>
+      <w:r>
+        <w:t> </w:t>
+      </w:r>
+      <w:r>
+        <w:t> </w:t>
+      </w:r>
+      <w:r>
+        <w:t xml:space="preserve">Enable  or </w:t>
+      </w:r>
+      <w:proofErr w:type="gramStart"/>
+      <w:r>
+        <w:t>Disable</w:t>
+      </w:r>
+      <w:proofErr w:type="gramEnd"/>
+      <w:r>
+        <w:t xml:space="preserve"> a region</w:t>
+      </w:r>
+    </w:p>
+    <w:p>
+      <w:pPr>
+        <w:spacing w:line="240" w:lineRule="auto"/>
+      </w:pPr>
+      <w:r>
+        <w:t> </w:t>
+      </w:r>
+      <w:r>
+        <w:t> </w:t>
+      </w:r>
+      <w:r>
+        <w:t> </w:t>
+      </w:r>
+      <w:r>
+        <w:t> </w:t>
+      </w:r>
+      <w:r>
+        <w:t xml:space="preserve">Freeze  a </w:t>
+      </w:r>
+      <w:proofErr w:type="spellStart"/>
+      <w:r>
+        <w:t>regiom</w:t>
+      </w:r>
+      <w:proofErr w:type="spellEnd"/>
+    </w:p>
+    <w:p>
+      <w:pPr>
+        <w:spacing w:line="240" w:lineRule="auto"/>
+      </w:pPr>
+      <w:r>
+        <w:t> </w:t>
+      </w:r>
+      <w:r>
+        <w:t> </w:t>
+      </w:r>
+      <w:r>
+        <w:t> </w:t>
+      </w:r>
+      <w:r>
+        <w:t> </w:t>
+      </w:r>
+      <w:r>
+        <w:t>Thaw a region</w:t>
+      </w:r>
+    </w:p>
+    <w:p>
+      <w:pPr>
+        <w:spacing w:line="240" w:lineRule="auto"/>
+      </w:pPr>
+      <w:r>
+        <w:t> </w:t>
+      </w:r>
+      <w:r>
+        <w:t> </w:t>
+      </w:r>
+      <w:r>
+        <w:t> </w:t>
+      </w:r>
+      <w:r>
+        <w:t> </w:t>
+      </w:r>
+      <w:proofErr w:type="spellStart"/>
+      <w:r>
+        <w:t>SetStatus</w:t>
+      </w:r>
+      <w:proofErr w:type="spellEnd"/>
+      <w:r>
+        <w:t>      Forces a region directly into a named state (e.g. Restart).</w:t>
+      </w:r>
+    </w:p>
+    <w:p>
+      <w:pPr>
+        <w:spacing w:line="240" w:lineRule="auto"/>
+      </w:pPr>
+    </w:p>
+    <w:p>
+      <w:pPr>
+        <w:spacing w:line="240" w:lineRule="auto"/>
+      </w:pPr>
+      <w:r>
+        <w:t xml:space="preserve">Level </w:t>
+      </w:r>
+      <w:proofErr w:type="spellStart"/>
+      <w:r>
+        <w:t>Webadmin</w:t>
+      </w:r>
+      <w:proofErr w:type="spellEnd"/>
+      <w:r>
+        <w:t xml:space="preserve"> is 500</w:t>
+      </w:r>
+    </w:p>
+    <w:p>
+      <w:pPr>
+        <w:spacing w:line="240" w:lineRule="auto"/>
+      </w:pPr>
+      <w:r>
+        <w:t> </w:t>
+      </w:r>
+      <w:r>
+        <w:t> </w:t>
+      </w:r>
+      <w:r>
+        <w:t> </w:t>
+      </w:r>
+      <w:r>
+        <w:t> </w:t>
+      </w:r>
+      <w:proofErr w:type="spellStart"/>
+      <w:r>
+        <w:t>StartIcecast</w:t>
+      </w:r>
+      <w:proofErr w:type="spellEnd"/>
+      <w:r>
+        <w:t>    </w:t>
+      </w:r>
+    </w:p>
+    <w:p>
+      <w:pPr>
+        <w:spacing w:line="240" w:lineRule="auto"/>
+      </w:pPr>
+      <w:r>
+        <w:t> </w:t>
+      </w:r>
+      <w:r>
+        <w:t> </w:t>
+      </w:r>
+      <w:r>
+        <w:t> </w:t>
+      </w:r>
+      <w:r>
+        <w:t> </w:t>
+      </w:r>
+      <w:proofErr w:type="spellStart"/>
+      <w:r>
+        <w:t>StopIcecast</w:t>
+      </w:r>
+      <w:proofErr w:type="spellEnd"/>
+      <w:r>
+        <w:t>     </w:t>
+      </w:r>
+    </w:p>
+    <w:p>
+      <w:pPr>
+        <w:spacing w:line="240" w:lineRule="auto"/>
+      </w:pPr>
+      <w:r>
+        <w:t> </w:t>
+      </w:r>
+      <w:r>
+        <w:t> </w:t>
+      </w:r>
+      <w:r>
+        <w:t> </w:t>
+      </w:r>
+      <w:r>
+        <w:t> </w:t>
+      </w:r>
+      <w:proofErr w:type="spellStart"/>
+      <w:r>
+        <w:t>StopRobust</w:t>
+      </w:r>
+      <w:proofErr w:type="spellEnd"/>
+      <w:r>
+        <w:t>      </w:t>
+      </w:r>
+    </w:p>
+    <w:p>
+      <w:pPr>
+        <w:spacing w:line="240" w:lineRule="auto"/>
+      </w:pPr>
+      <w:r>
+        <w:t> </w:t>
+      </w:r>
+      <w:r>
+        <w:t> </w:t>
+      </w:r>
+      <w:r>
+        <w:t> </w:t>
+      </w:r>
+      <w:r>
+        <w:t> </w:t>
+      </w:r>
+      <w:proofErr w:type="spellStart"/>
+      <w:r>
+        <w:t>StopDreamGrid</w:t>
+      </w:r>
+      <w:proofErr w:type="spellEnd"/>
+      <w:r>
+        <w:t>   </w:t>
+      </w:r>
+    </w:p>
+    <w:p>
+      <w:pPr>
+        <w:spacing w:line="240" w:lineRule="auto"/>
+      </w:pPr>
+      <w:r>
+        <w:t> </w:t>
+      </w:r>
+      <w:r>
+        <w:t> </w:t>
+      </w:r>
+      <w:r>
+        <w:t> </w:t>
+      </w:r>
+      <w:r>
+        <w:t> </w:t>
+      </w:r>
+      <w:proofErr w:type="spellStart"/>
+      <w:r>
+        <w:t>RestartAll</w:t>
+      </w:r>
+      <w:proofErr w:type="spellEnd"/>
+      <w:r>
+        <w:t>      Regions</w:t>
+      </w:r>
+    </w:p>
+    <w:p>
+      <w:pPr>
+        <w:spacing w:line="240" w:lineRule="auto"/>
+      </w:pPr>
+      <w:r>
+        <w:t> </w:t>
+      </w:r>
+      <w:r>
+        <w:t> </w:t>
+      </w:r>
+      <w:r>
+        <w:t> </w:t>
+      </w:r>
+      <w:r>
+        <w:t> </w:t>
+      </w:r>
+      <w:proofErr w:type="spellStart"/>
+      <w:r>
+        <w:t>StartMysql</w:t>
+      </w:r>
+      <w:proofErr w:type="spellEnd"/>
+      <w:r>
+        <w:t>      </w:t>
+      </w:r>
+    </w:p>
+    <w:p>
+      <w:pPr>
+        <w:spacing w:line="240" w:lineRule="auto"/>
+      </w:pPr>
+      <w:r>
+        <w:t> </w:t>
+      </w:r>
+      <w:r>
+        <w:t> </w:t>
+      </w:r>
+      <w:r>
+        <w:t> </w:t>
+      </w:r>
+      <w:r>
+        <w:t> </w:t>
+      </w:r>
+      <w:proofErr w:type="spellStart"/>
+      <w:r>
+        <w:t>StopMysql</w:t>
+      </w:r>
+      <w:proofErr w:type="spellEnd"/>
+      <w:r>
+        <w:t>      </w:t>
+      </w:r>
+    </w:p>
+    <w:p>
+      <w:pPr>
+        <w:spacing w:line="240" w:lineRule="auto"/>
+      </w:pPr>
+      <w:r>
+        <w:t xml:space="preserve">     Reboot the server</w:t>
+      </w:r>
+      <w:r>
+        <w:t> </w:t>
+      </w:r>
+    </w:p>
+    <w:p>
+      <w:pPr>
+        <w:spacing w:line="240" w:lineRule="auto"/>
+      </w:pPr>
+    </w:p>
+    <w:p>
+      <w:pPr>
+        <w:spacing w:line="240" w:lineRule="auto"/>
+      </w:pPr>
+      <w:r>
+        <w:t xml:space="preserve">If they know the </w:t>
+      </w:r>
+      <w:r>
+        <w:t xml:space="preserve">machines </w:t>
+      </w:r>
+      <w:proofErr w:type="spellStart"/>
+      <w:r>
+        <w:t>hash</w:t>
+      </w:r>
+      <w:r>
+        <w:t>+salt</w:t>
+      </w:r>
+      <w:proofErr w:type="spellEnd"/>
+      <w:r>
+        <w:t xml:space="preserve"> and </w:t>
+      </w:r>
+      <w:proofErr w:type="gramStart"/>
+      <w:r>
+        <w:t>used</w:t>
+      </w:r>
+      <w:proofErr w:type="gramEnd"/>
+      <w:r>
+        <w:t xml:space="preserve"> it for the password</w:t>
+      </w:r>
+    </w:p>
+    <w:p>
+      <w:pPr>
+        <w:spacing w:line="240" w:lineRule="auto"/>
+      </w:pPr>
+      <w:r>
+        <w:t> </w:t>
+      </w:r>
+      <w:r>
+        <w:t> </w:t>
+      </w:r>
+      <w:r>
+        <w:t> </w:t>
+      </w:r>
+      <w:r>
+        <w:t> </w:t>
+      </w:r>
+      <w:proofErr w:type="spellStart"/>
+      <w:r>
+        <w:t>StopApache</w:t>
+      </w:r>
+      <w:proofErr w:type="spellEnd"/>
+      <w:r>
+        <w:t xml:space="preserve"> - shuts down the API.</w:t>
+      </w:r>
+    </w:p>
+    <w:p>
+      <w:pPr>
+        <w:spacing w:line="240" w:lineRule="auto"/>
+      </w:pPr>
+      <w:r>
+        <w:t xml:space="preserve">     Reboot the server</w:t>
+      </w:r>
+    </w:p>
+    <w:p>
+      <w:pPr>
+        <w:spacing w:line="240" w:lineRule="auto"/>
+      </w:pPr>
+    </w:p>
+    <w:p>
+      <w:pPr>
+        <w:spacing w:line="240" w:lineRule="auto"/>
+      </w:pPr>
+      <w:r>
+        <w:t>See the user control panel in the Regions list.</w:t>
+      </w:r>
+    </w:p>
+    <w:p>
+      <w:pPr>
+        <w:spacing w:line="240" w:lineRule="auto"/>
+      </w:pPr>
+    </w:p>
+    <w:p>
+      <w:pPr>
+        <w:spacing w:line="240" w:lineRule="auto"/>
+      </w:pPr>
+      <w:r>
+        <w:rPr>
+          <w:noProof/>
+        </w:rPr>
+        <w:drawing>
+          <wp:inline distT="0" distB="0" distL="0" distR="0" wp14:anchorId="4AC4DDB1" wp14:editId="6F118DEA">
+            <wp:extent cx="4848225" cy="3848100"/>
+            <wp:effectExtent l="0" t="0" r="0" b="0"/>
+            <wp:docPr id="1313221708" name="Picture 2"/>
+            <wp:cNvGraphicFramePr>
+              <a:graphicFrameLocks xmlns:a="http://schemas.openxmlformats.org/drawingml/2006/main" noChangeAspect="1"/>
+            </wp:cNvGraphicFramePr>
+            <a:graphic xmlns:a="http://schemas.openxmlformats.org/drawingml/2006/main">
+              <a:graphicData uri="http://schemas.openxmlformats.org/drawingml/2006/picture">
+                <pic:pic xmlns:pic="http://schemas.openxmlformats.org/drawingml/2006/picture">
+                  <pic:nvPicPr>
+                    <pic:cNvPr id="0" name="Picture 6"/>
+                    <pic:cNvPicPr>
+                      <a:picLocks noChangeAspect="1" noChangeArrowheads="1"/>
+                    </pic:cNvPicPr>
+                  </pic:nvPicPr>
+                  <pic:blipFill>
+                    <a:blip r:embed="rId5">
+                      <a:extLst>
+                        <a:ext uri="{28A0092B-C50C-407E-A947-70E740481C1C}">
+                          <a14:useLocalDpi xmlns:a14="http://schemas.microsoft.com/office/drawing/2010/main" val="0"/>
+                        </a:ext>
+                      </a:extLst>
+                    </a:blip>
+                    <a:srcRect/>
+                    <a:stretch>
+                      <a:fillRect/>
+                    </a:stretch>
+                  </pic:blipFill>
+                  <pic:spPr bwMode="auto">
+                    <a:xfrm>
+                      <a:off x="0" y="0"/>
+                      <a:ext cx="4848225" cy="3848100"/>
+                    </a:xfrm>
+                    <a:prstGeom prst="rect">
+                      <a:avLst/>
+                    </a:prstGeom>
+                    <a:noFill/>
+                    <a:ln>
+                      <a:noFill/>
+                    </a:ln>
+                  </pic:spPr>
+                </pic:pic>
+              </a:graphicData>
+            </a:graphic>
+          </wp:inline>
+        </w:drawing>
+      </w:r>
+    </w:p>
+    <w:p>
+      <w:pPr>
+        <w:spacing w:line="240" w:lineRule="auto"/>
+      </w:pPr>
+    </w:p>
+    <w:p>
+      <w:pPr>
+        <w:spacing w:line="240" w:lineRule="auto"/>
+      </w:pPr>
+      <w:r>
+        <w:t xml:space="preserve">It also supports Ownership. If you are the owner of an estate, you own it.  </w:t>
+      </w:r>
+    </w:p>
+    <w:p>
+      <w:pPr>
+        <w:spacing w:line="240" w:lineRule="auto"/>
+      </w:pPr>
+      <w:r>
+        <w:t>IARs can be saved by the user, but only their</w:t>
+      </w:r>
+      <w:r>
+        <w:t xml:space="preserve"> IAR</w:t>
+      </w:r>
+    </w:p>
+    <w:p>
+      <w:pPr>
+        <w:spacing w:line="240" w:lineRule="auto"/>
+      </w:pPr>
+      <w:r>
+        <w:t>Only</w:t>
+      </w:r>
+      <w:r>
+        <w:t xml:space="preserve"> </w:t>
+      </w:r>
+      <w:r>
+        <w:t>the web admin can restart the PC.</w:t>
+      </w:r>
+    </w:p>
+    <w:p>
+      <w:pPr>
+        <w:spacing w:line="240" w:lineRule="auto"/>
+      </w:pPr>
+    </w:p>
+    <w:p>
+      <w:pPr>
         <w:pStyle w:val="Heading2"/>
       </w:pPr>
       <w:r>
@@ -75,52 +920,181 @@
         <w:spacing w:line="240" w:lineRule="auto"/>
       </w:pPr>
       <w:r>
-        <w:t xml:space="preserve">        command={UrlEncode(command)}</w:t>
-      </w:r>
-    </w:p>
-    <w:p>
-      <w:pPr>
-        <w:spacing w:line="240" w:lineRule="auto"/>
-      </w:pPr>
-      <w:r>
-        <w:t xml:space="preserve">        &amp;password={UrlEncode(MachineHash or avatar password)}</w:t>
-      </w:r>
-    </w:p>
-    <w:p>
-      <w:pPr>
-        <w:spacing w:line="240" w:lineRule="auto"/>
-      </w:pPr>
-      <w:r>
-        <w:t xml:space="preserve">        &amp;avatar={UrlEncode(AvatarName)}          (needed for avatar-level auth)</w:t>
-      </w:r>
-    </w:p>
-    <w:p>
-      <w:pPr>
-        <w:spacing w:line="240" w:lineRule="auto"/>
-      </w:pPr>
-      <w:r>
-        <w:t xml:space="preserve">        &amp;RegionUUID={UrlEncode(regionUuid)}      (region commands)</w:t>
-      </w:r>
-    </w:p>
-    <w:p>
-      <w:pPr>
-        <w:spacing w:line="240" w:lineRule="auto"/>
-      </w:pPr>
-      <w:r>
-        <w:t xml:space="preserve">        &amp;RegionName={UrlEncode(regionName)}      (region commands, alternative to RegionUUID)</w:t>
-      </w:r>
-    </w:p>
-    <w:p>
-      <w:pPr>
-        <w:spacing w:line="240" w:lineRule="auto"/>
-      </w:pPr>
-    </w:p>
-    <w:p>
-      <w:pPr>
-        <w:spacing w:line="240" w:lineRule="auto"/>
-      </w:pPr>
-      <w:r>
-        <w:t>Parameter names are read case-insensitively (Command/command/COMMAND all work), so existing links using capitalized names still work.</w:t>
+        <w:t xml:space="preserve">        command={</w:t>
+      </w:r>
+      <w:proofErr w:type="spellStart"/>
+      <w:r>
+        <w:t>UrlEncode</w:t>
+      </w:r>
+      <w:proofErr w:type="spellEnd"/>
+      <w:r>
+        <w:t>(</w:t>
+      </w:r>
+      <w:proofErr w:type="gramStart"/>
+      <w:r>
+        <w:t>command)}</w:t>
+      </w:r>
+      <w:proofErr w:type="gramEnd"/>
+    </w:p>
+    <w:p>
+      <w:pPr>
+        <w:spacing w:line="240" w:lineRule="auto"/>
+      </w:pPr>
+      <w:r>
+        <w:t xml:space="preserve">        &amp;password={</w:t>
+      </w:r>
+      <w:proofErr w:type="spellStart"/>
+      <w:r>
+        <w:t>UrlEncode</w:t>
+      </w:r>
+      <w:proofErr w:type="spellEnd"/>
+      <w:r>
+        <w:t>(</w:t>
+      </w:r>
+      <w:proofErr w:type="spellStart"/>
+      <w:r>
+        <w:t>MachineHash</w:t>
+      </w:r>
+      <w:proofErr w:type="spellEnd"/>
+      <w:r>
+        <w:t xml:space="preserve"> or avatar </w:t>
+      </w:r>
+      <w:proofErr w:type="gramStart"/>
+      <w:r>
+        <w:t>password)}</w:t>
+      </w:r>
+      <w:proofErr w:type="gramEnd"/>
+    </w:p>
+    <w:p>
+      <w:pPr>
+        <w:spacing w:line="240" w:lineRule="auto"/>
+      </w:pPr>
+      <w:r>
+        <w:t xml:space="preserve">        &amp;avatar={</w:t>
+      </w:r>
+      <w:proofErr w:type="spellStart"/>
+      <w:r>
+        <w:t>UrlEncode</w:t>
+      </w:r>
+      <w:proofErr w:type="spellEnd"/>
+      <w:r>
+        <w:t>(</w:t>
+      </w:r>
+      <w:proofErr w:type="spellStart"/>
+      <w:proofErr w:type="gramStart"/>
+      <w:r>
+        <w:t>AvatarName</w:t>
+      </w:r>
+      <w:proofErr w:type="spellEnd"/>
+      <w:r>
+        <w:t xml:space="preserve">)}         </w:t>
+      </w:r>
+      <w:proofErr w:type="gramEnd"/>
+      <w:r>
+        <w:t xml:space="preserve"> (needed for avatar-level auth)</w:t>
+      </w:r>
+    </w:p>
+    <w:p>
+      <w:pPr>
+        <w:spacing w:line="240" w:lineRule="auto"/>
+      </w:pPr>
+      <w:r>
+        <w:t xml:space="preserve">        &amp;</w:t>
+      </w:r>
+      <w:proofErr w:type="spellStart"/>
+      <w:r>
+        <w:t>RegionUUID</w:t>
+      </w:r>
+      <w:proofErr w:type="spellEnd"/>
+      <w:r>
+        <w:t>={</w:t>
+      </w:r>
+      <w:proofErr w:type="spellStart"/>
+      <w:r>
+        <w:t>UrlEncode</w:t>
+      </w:r>
+      <w:proofErr w:type="spellEnd"/>
+      <w:r>
+        <w:t>(</w:t>
+      </w:r>
+      <w:proofErr w:type="spellStart"/>
+      <w:proofErr w:type="gramStart"/>
+      <w:r>
+        <w:t>regionUuid</w:t>
+      </w:r>
+      <w:proofErr w:type="spellEnd"/>
+      <w:r>
+        <w:t xml:space="preserve">)}     </w:t>
+      </w:r>
+      <w:proofErr w:type="gramEnd"/>
+      <w:r>
+        <w:t xml:space="preserve"> (region commands)</w:t>
+      </w:r>
+    </w:p>
+    <w:p>
+      <w:pPr>
+        <w:spacing w:line="240" w:lineRule="auto"/>
+      </w:pPr>
+      <w:r>
+        <w:t xml:space="preserve">        &amp;</w:t>
+      </w:r>
+      <w:proofErr w:type="spellStart"/>
+      <w:r>
+        <w:t>RegionName</w:t>
+      </w:r>
+      <w:proofErr w:type="spellEnd"/>
+      <w:r>
+        <w:t>={</w:t>
+      </w:r>
+      <w:proofErr w:type="spellStart"/>
+      <w:r>
+        <w:t>UrlEncode</w:t>
+      </w:r>
+      <w:proofErr w:type="spellEnd"/>
+      <w:r>
+        <w:t>(</w:t>
+      </w:r>
+      <w:proofErr w:type="spellStart"/>
+      <w:proofErr w:type="gramStart"/>
+      <w:r>
+        <w:t>regionName</w:t>
+      </w:r>
+      <w:proofErr w:type="spellEnd"/>
+      <w:r>
+        <w:t xml:space="preserve">)}     </w:t>
+      </w:r>
+      <w:proofErr w:type="gramEnd"/>
+      <w:r>
+        <w:t xml:space="preserve"> (region commands, alternative to </w:t>
+      </w:r>
+      <w:proofErr w:type="spellStart"/>
+      <w:r>
+        <w:t>RegionUUID</w:t>
+      </w:r>
+      <w:proofErr w:type="spellEnd"/>
+      <w:r>
+        <w:t>)</w:t>
+      </w:r>
+    </w:p>
+    <w:p>
+      <w:pPr>
+        <w:spacing w:line="240" w:lineRule="auto"/>
+      </w:pPr>
+    </w:p>
+    <w:p>
+      <w:pPr>
+        <w:spacing w:line="240" w:lineRule="auto"/>
+      </w:pPr>
+      <w:r>
+        <w:t>Parameter names are read case-insensitively (</w:t>
+      </w:r>
+      <w:proofErr w:type="gramStart"/>
+      <w:r>
+        <w:t>Command/command</w:t>
+      </w:r>
+      <w:proofErr w:type="gramEnd"/>
+      <w:r>
+        <w:t>/COMMAND all work), so existing links using capitalized names still work.</w:t>
       </w:r>
     </w:p>
     <w:p>
@@ -151,7 +1125,15 @@
         <w:ind w:left="1440" w:hanging="1440"/>
       </w:pPr>
       <w:r>
-        <w:t>password     required  Either the grid's MachineHash (see "Authentication" below) for full admin</w:t>
+        <w:t xml:space="preserve">password     required  Either the grid's </w:t>
+      </w:r>
+      <w:proofErr w:type="spellStart"/>
+      <w:r>
+        <w:t>MachineHash</w:t>
+      </w:r>
+      <w:proofErr w:type="spellEnd"/>
+      <w:r>
+        <w:t xml:space="preserve"> (see "Authentication" below) for full admin</w:t>
       </w:r>
     </w:p>
     <w:p>
@@ -173,7 +1155,15 @@
       </w:r>
       <w:r>
         <w:tab/>
-        <w:t>optional    Avatar name to check permission level for, when not using the MachineHash.</w:t>
+        <w:t xml:space="preserve">optional    Avatar name to check permission level for, when not using the </w:t>
+      </w:r>
+      <w:proofErr w:type="spellStart"/>
+      <w:r>
+        <w:t>MachineHash</w:t>
+      </w:r>
+      <w:proofErr w:type="spellEnd"/>
+      <w:r>
+        <w:t>.</w:t>
       </w:r>
     </w:p>
     <w:p>
@@ -181,8 +1171,13 @@
         <w:spacing w:line="240" w:lineRule="auto"/>
         <w:ind w:left="1440" w:hanging="1440"/>
       </w:pPr>
-      <w:r>
-        <w:t>RegionUUID  optional    Target region's UUID. URL-escape as needed  (e.g. %2D for a hyphen).</w:t>
+      <w:proofErr w:type="spellStart"/>
+      <w:r>
+        <w:t>RegionUUID</w:t>
+      </w:r>
+      <w:proofErr w:type="spellEnd"/>
+      <w:r>
+        <w:t xml:space="preserve">  optional    Target region's UUID. URL-escape as needed  (e.g. %2D for a hyphen).</w:t>
       </w:r>
     </w:p>
     <w:p>
@@ -190,8 +1185,37 @@
         <w:spacing w:line="240" w:lineRule="auto"/>
         <w:ind w:left="2520" w:hanging="2520"/>
       </w:pPr>
-      <w:r>
-        <w:t>RegionName optional    Target region's name instead of its UUID (e.g. %20 for a space). Resolved to a UUIDinternally. Use RegionUUID or RegionName, not both.</w:t>
+      <w:proofErr w:type="spellStart"/>
+      <w:r>
+        <w:t>RegionName</w:t>
+      </w:r>
+      <w:proofErr w:type="spellEnd"/>
+      <w:r>
+        <w:t xml:space="preserve"> optional    Target region's name instead of its UUID (e.g. %20 for a space). Resolved to a </w:t>
+      </w:r>
+      <w:proofErr w:type="spellStart"/>
+      <w:r>
+        <w:t>UUIDinternally</w:t>
+      </w:r>
+      <w:proofErr w:type="spellEnd"/>
+      <w:r>
+        <w:t xml:space="preserve">. Use </w:t>
+      </w:r>
+      <w:proofErr w:type="spellStart"/>
+      <w:r>
+        <w:t>RegionUUID</w:t>
+      </w:r>
+      <w:proofErr w:type="spellEnd"/>
+      <w:r>
+        <w:t xml:space="preserve"> or </w:t>
+      </w:r>
+      <w:proofErr w:type="spellStart"/>
+      <w:r>
+        <w:t>RegionName</w:t>
+      </w:r>
+      <w:proofErr w:type="spellEnd"/>
+      <w:r>
+        <w:t>, not both.</w:t>
       </w:r>
     </w:p>
     <w:p>
@@ -227,7 +1251,15 @@
         <w:ind w:left="1440" w:hanging="1440"/>
       </w:pPr>
       <w:r>
-        <w:t>param        command-    Used by the "SetStatus" command.</w:t>
+        <w:t>param        command-    Used by the "</w:t>
+      </w:r>
+      <w:proofErr w:type="spellStart"/>
+      <w:r>
+        <w:t>SetStatus</w:t>
+      </w:r>
+      <w:proofErr w:type="spellEnd"/>
+      <w:r>
+        <w:t>" command.</w:t>
       </w:r>
     </w:p>
     <w:p>
@@ -244,8 +1276,21 @@
         <w:spacing w:line="240" w:lineRule="auto"/>
         <w:ind w:left="1440" w:hanging="1440"/>
       </w:pPr>
-      <w:r>
-        <w:t>AvatarName   command-    Used by "SaveIAR" (the avatar whose specific inventory to archive).</w:t>
+      <w:proofErr w:type="spellStart"/>
+      <w:r>
+        <w:t>AvatarName</w:t>
+      </w:r>
+      <w:proofErr w:type="spellEnd"/>
+      <w:r>
+        <w:t xml:space="preserve">   command-    Used by "</w:t>
+      </w:r>
+      <w:proofErr w:type="spellStart"/>
+      <w:r>
+        <w:t>SaveIAR</w:t>
+      </w:r>
+      <w:proofErr w:type="spellEnd"/>
+      <w:r>
+        <w:t>" (the avatar whose specific inventory to archive).</w:t>
       </w:r>
     </w:p>
     <w:p>
@@ -261,15 +1306,31 @@
         <w:spacing w:line="240" w:lineRule="auto"/>
       </w:pPr>
       <w:r>
-        <w:t>Every command runs through CheckPerms(avatar, password), which grants one of these permission levels:</w:t>
-      </w:r>
-    </w:p>
-    <w:p>
-      <w:pPr>
-        <w:spacing w:line="240" w:lineRule="auto"/>
-      </w:pPr>
-      <w:r>
-        <w:t xml:space="preserve">    1000  password exactly matches the grid's MachineHash  (full admin - can do anything)</w:t>
+        <w:t xml:space="preserve">Every command runs through </w:t>
+      </w:r>
+      <w:proofErr w:type="spellStart"/>
+      <w:r>
+        <w:t>CheckPerms</w:t>
+      </w:r>
+      <w:proofErr w:type="spellEnd"/>
+      <w:r>
+        <w:t>(avatar, password), which grants one of these permission levels:</w:t>
+      </w:r>
+    </w:p>
+    <w:p>
+      <w:pPr>
+        <w:spacing w:line="240" w:lineRule="auto"/>
+      </w:pPr>
+      <w:r>
+        <w:t xml:space="preserve">    1000  password exactly matches the grid's </w:t>
+      </w:r>
+      <w:proofErr w:type="spellStart"/>
+      <w:r>
+        <w:t>MachineHash</w:t>
+      </w:r>
+      <w:proofErr w:type="spellEnd"/>
+      <w:r>
+        <w:t xml:space="preserve">  (full admin - can do anything)</w:t>
       </w:r>
     </w:p>
     <w:p>
@@ -294,15 +1355,39 @@
         <w:spacing w:line="240" w:lineRule="auto"/>
       </w:pPr>
       <w:r>
-        <w:t>Each command below requires a minimum level; if you don't meet it you get back "NAK You do not have permission to ...".</w:t>
-      </w:r>
-    </w:p>
-    <w:p>
-      <w:pPr>
-        <w:spacing w:line="240" w:lineRule="auto"/>
-      </w:pPr>
-      <w:r>
-        <w:t>The MachineHash is stored in OutworldzFiles\Settings.ini (key: MachineHash) - it is the MD5 of the grid's Dyn DNS password.</w:t>
+        <w:t xml:space="preserve">Each command below requires a minimum level; if you don't meet </w:t>
+      </w:r>
+      <w:proofErr w:type="gramStart"/>
+      <w:r>
+        <w:t>it</w:t>
+      </w:r>
+      <w:proofErr w:type="gramEnd"/>
+      <w:r>
+        <w:t xml:space="preserve"> you get back "NAK You do not have permission to ...".</w:t>
+      </w:r>
+    </w:p>
+    <w:p>
+      <w:pPr>
+        <w:spacing w:line="240" w:lineRule="auto"/>
+      </w:pPr>
+      <w:r>
+        <w:t xml:space="preserve">The </w:t>
+      </w:r>
+      <w:proofErr w:type="spellStart"/>
+      <w:r>
+        <w:t>MachineHash</w:t>
+      </w:r>
+      <w:proofErr w:type="spellEnd"/>
+      <w:r>
+        <w:t xml:space="preserve"> is stored in OutworldzFiles\Settings.ini (key: </w:t>
+      </w:r>
+      <w:proofErr w:type="spellStart"/>
+      <w:r>
+        <w:t>MachineHash</w:t>
+      </w:r>
+      <w:proofErr w:type="spellEnd"/>
+      <w:r>
+        <w:t>) - it is the MD5 of the grid's Dyn DNS password.</w:t>
       </w:r>
     </w:p>
     <w:p>
@@ -341,8 +1426,13 @@
       <w:pPr>
         <w:spacing w:line="240" w:lineRule="auto"/>
       </w:pPr>
-      <w:r>
-        <w:t>StartDreamGrid   (level &gt;= 200)</w:t>
+      <w:proofErr w:type="spellStart"/>
+      <w:r>
+        <w:t>StartDreamGrid</w:t>
+      </w:r>
+      <w:proofErr w:type="spellEnd"/>
+      <w:r>
+        <w:t xml:space="preserve">   (level &gt;= 200)</w:t>
       </w:r>
     </w:p>
     <w:p>
@@ -365,8 +1455,13 @@
       <w:pPr>
         <w:spacing w:line="240" w:lineRule="auto"/>
       </w:pPr>
-      <w:r>
-        <w:t>StopDreamGrid    (level &gt; 200)</w:t>
+      <w:proofErr w:type="spellStart"/>
+      <w:r>
+        <w:t>StopDreamGrid</w:t>
+      </w:r>
+      <w:proofErr w:type="spellEnd"/>
+      <w:r>
+        <w:t xml:space="preserve">    (level &gt; 200)</w:t>
       </w:r>
     </w:p>
     <w:p>
@@ -389,17 +1484,35 @@
       <w:pPr>
         <w:spacing w:line="240" w:lineRule="auto"/>
       </w:pPr>
-      <w:r>
-        <w:t>RestartAll       (level &gt;= 200)</w:t>
-      </w:r>
-    </w:p>
-    <w:p>
-      <w:pPr>
-        <w:spacing w:line="240" w:lineRule="auto"/>
-      </w:pPr>
-      <w:r>
-        <w:t xml:space="preserve">    Stops the grid, then relaunches Start.exe entirely (a full</w:t>
-      </w:r>
+      <w:proofErr w:type="spellStart"/>
+      <w:r>
+        <w:t>RestartAll</w:t>
+      </w:r>
+      <w:proofErr w:type="spellEnd"/>
+      <w:r>
+        <w:t xml:space="preserve">       (level &gt;= 200)</w:t>
+      </w:r>
+    </w:p>
+    <w:p>
+      <w:pPr>
+        <w:spacing w:line="240" w:lineRule="auto"/>
+      </w:pPr>
+      <w:r>
+        <w:t xml:space="preserve">    </w:t>
+      </w:r>
+      <w:proofErr w:type="gramStart"/>
+      <w:r>
+        <w:t>Stops</w:t>
+      </w:r>
+      <w:proofErr w:type="gramEnd"/>
+      <w:r>
+        <w:t xml:space="preserve"> the grid, then relaunches Start.exe entirely (</w:t>
+      </w:r>
+      <w:proofErr w:type="gramStart"/>
+      <w:r>
+        <w:t>a full</w:t>
+      </w:r>
+      <w:proofErr w:type="gramEnd"/>
     </w:p>
     <w:p>
       <w:pPr>
@@ -430,15 +1543,28 @@
         <w:spacing w:line="240" w:lineRule="auto"/>
       </w:pPr>
       <w:r>
-        <w:t>MySQL is started automatically when DreamGrid itself starts.</w:t>
-      </w:r>
-    </w:p>
-    <w:p>
-      <w:pPr>
-        <w:spacing w:line="240" w:lineRule="auto"/>
-      </w:pPr>
-      <w:r>
-        <w:t>StartMysql       (level &gt;= 200)</w:t>
+        <w:t xml:space="preserve">MySQL </w:t>
+      </w:r>
+      <w:proofErr w:type="gramStart"/>
+      <w:r>
+        <w:t>is started</w:t>
+      </w:r>
+      <w:proofErr w:type="gramEnd"/>
+      <w:r>
+        <w:t xml:space="preserve"> automatically when DreamGrid itself starts.</w:t>
+      </w:r>
+    </w:p>
+    <w:p>
+      <w:pPr>
+        <w:spacing w:line="240" w:lineRule="auto"/>
+      </w:pPr>
+      <w:proofErr w:type="spellStart"/>
+      <w:r>
+        <w:t>StartMysql</w:t>
+      </w:r>
+      <w:proofErr w:type="spellEnd"/>
+      <w:r>
+        <w:t xml:space="preserve">       (level &gt;= 200)</w:t>
       </w:r>
     </w:p>
     <w:p>
@@ -453,9 +1579,13 @@
       <w:pPr>
         <w:spacing w:line="240" w:lineRule="auto"/>
       </w:pPr>
-      <w:r>
-        <w:lastRenderedPageBreak/>
-        <w:t>StopMysql        (level &gt;= 200)</w:t>
+      <w:proofErr w:type="spellStart"/>
+      <w:r>
+        <w:t>StopMysql</w:t>
+      </w:r>
+      <w:proofErr w:type="spellEnd"/>
+      <w:r>
+        <w:t xml:space="preserve">        (level &gt;= 200)</w:t>
       </w:r>
     </w:p>
     <w:p>
@@ -479,15 +1609,28 @@
         <w:spacing w:line="240" w:lineRule="auto"/>
       </w:pPr>
       <w:r>
-        <w:t>Robust is started automatically after MySQL when DreamGrid starts.</w:t>
-      </w:r>
-    </w:p>
-    <w:p>
-      <w:pPr>
-        <w:spacing w:line="240" w:lineRule="auto"/>
-      </w:pPr>
-      <w:r>
-        <w:t>StartRobust      (level &gt; 0)</w:t>
+        <w:t xml:space="preserve">Robust </w:t>
+      </w:r>
+      <w:proofErr w:type="gramStart"/>
+      <w:r>
+        <w:t>is started</w:t>
+      </w:r>
+      <w:proofErr w:type="gramEnd"/>
+      <w:r>
+        <w:t xml:space="preserve"> automatically after MySQL when DreamGrid starts.</w:t>
+      </w:r>
+    </w:p>
+    <w:p>
+      <w:pPr>
+        <w:spacing w:line="240" w:lineRule="auto"/>
+      </w:pPr>
+      <w:proofErr w:type="spellStart"/>
+      <w:r>
+        <w:t>StartRobust</w:t>
+      </w:r>
+      <w:proofErr w:type="spellEnd"/>
+      <w:r>
+        <w:t xml:space="preserve">      (level &gt; 0)</w:t>
       </w:r>
     </w:p>
     <w:p>
@@ -502,8 +1645,13 @@
       <w:pPr>
         <w:spacing w:line="240" w:lineRule="auto"/>
       </w:pPr>
-      <w:r>
-        <w:t>StopRobust       (level &gt; 200)</w:t>
+      <w:proofErr w:type="spellStart"/>
+      <w:r>
+        <w:t>StopRobust</w:t>
+      </w:r>
+      <w:proofErr w:type="spellEnd"/>
+      <w:r>
+        <w:t xml:space="preserve">       (level &gt; 200)</w:t>
       </w:r>
     </w:p>
     <w:p>
@@ -526,8 +1674,21 @@
       <w:pPr>
         <w:spacing w:line="240" w:lineRule="auto"/>
       </w:pPr>
-      <w:r>
-        <w:t>StartApache      (level = 1000, MachineHash only)</w:t>
+      <w:proofErr w:type="spellStart"/>
+      <w:r>
+        <w:t>StartApache</w:t>
+      </w:r>
+      <w:proofErr w:type="spellEnd"/>
+      <w:r>
+        <w:t xml:space="preserve">      (level = 1000, </w:t>
+      </w:r>
+      <w:proofErr w:type="spellStart"/>
+      <w:r>
+        <w:t>MachineHash</w:t>
+      </w:r>
+      <w:proofErr w:type="spellEnd"/>
+      <w:r>
+        <w:t xml:space="preserve"> only)</w:t>
       </w:r>
     </w:p>
     <w:p>
@@ -542,8 +1703,21 @@
       <w:pPr>
         <w:spacing w:line="240" w:lineRule="auto"/>
       </w:pPr>
-      <w:r>
-        <w:t>StopApache       (level = 1000, MachineHash only)</w:t>
+      <w:proofErr w:type="spellStart"/>
+      <w:r>
+        <w:t>StopApache</w:t>
+      </w:r>
+      <w:proofErr w:type="spellEnd"/>
+      <w:r>
+        <w:t xml:space="preserve">       (level = 1000, </w:t>
+      </w:r>
+      <w:proofErr w:type="spellStart"/>
+      <w:r>
+        <w:t>MachineHash</w:t>
+      </w:r>
+      <w:proofErr w:type="spellEnd"/>
+      <w:r>
+        <w:t xml:space="preserve"> only)</w:t>
       </w:r>
     </w:p>
     <w:p>
@@ -566,8 +1740,13 @@
       <w:pPr>
         <w:spacing w:line="240" w:lineRule="auto"/>
       </w:pPr>
-      <w:r>
-        <w:t>StartIcecast     (level &gt; 200)</w:t>
+      <w:proofErr w:type="spellStart"/>
+      <w:r>
+        <w:t>StartIcecast</w:t>
+      </w:r>
+      <w:proofErr w:type="spellEnd"/>
+      <w:r>
+        <w:t xml:space="preserve">     (level &gt; 200)</w:t>
       </w:r>
     </w:p>
     <w:p>
@@ -587,8 +1766,13 @@
       <w:pPr>
         <w:spacing w:line="240" w:lineRule="auto"/>
       </w:pPr>
-      <w:r>
-        <w:t>StopIcecast      (level &gt; 200)</w:t>
+      <w:proofErr w:type="spellStart"/>
+      <w:r>
+        <w:t>StopIcecast</w:t>
+      </w:r>
+      <w:proofErr w:type="spellEnd"/>
+      <w:r>
+        <w:t xml:space="preserve">      (level &gt; 200)</w:t>
       </w:r>
     </w:p>
     <w:p>
@@ -598,7 +1782,7 @@
       <w:r>
         <w:t xml:space="preserve">    </w:t>
       </w:r>
-      <w:hyperlink r:id="rId5" w:history="1">
+      <w:hyperlink r:id="rId6" w:history="1">
         <w:r>
           <w:rPr>
             <w:rStyle w:val="Hyperlink"/>
@@ -625,16 +1809,37 @@
       <w:pPr>
         <w:spacing w:line="240" w:lineRule="auto"/>
       </w:pPr>
-      <w:r>
-        <w:t>StartRegion      (level &gt; 1)</w:t>
-      </w:r>
-    </w:p>
-    <w:p>
-      <w:pPr>
-        <w:spacing w:line="240" w:lineRule="auto"/>
-      </w:pPr>
-      <w:r>
-        <w:t xml:space="preserve">    Boots RegionUUID or RegionName if not already running.</w:t>
+      <w:proofErr w:type="spellStart"/>
+      <w:r>
+        <w:t>StartRegion</w:t>
+      </w:r>
+      <w:proofErr w:type="spellEnd"/>
+      <w:r>
+        <w:t xml:space="preserve">      (level &gt; 1)</w:t>
+      </w:r>
+    </w:p>
+    <w:p>
+      <w:pPr>
+        <w:spacing w:line="240" w:lineRule="auto"/>
+      </w:pPr>
+      <w:r>
+        <w:t xml:space="preserve">    Boots </w:t>
+      </w:r>
+      <w:proofErr w:type="spellStart"/>
+      <w:r>
+        <w:t>RegionUUID</w:t>
+      </w:r>
+      <w:proofErr w:type="spellEnd"/>
+      <w:r>
+        <w:t xml:space="preserve"> or </w:t>
+      </w:r>
+      <w:proofErr w:type="spellStart"/>
+      <w:r>
+        <w:t>RegionName</w:t>
+      </w:r>
+      <w:proofErr w:type="spellEnd"/>
+      <w:r>
+        <w:t xml:space="preserve"> if not already running.</w:t>
       </w:r>
     </w:p>
     <w:p>
@@ -654,8 +1859,13 @@
       <w:pPr>
         <w:spacing w:line="240" w:lineRule="auto"/>
       </w:pPr>
-      <w:r>
-        <w:t>StopRegion       (level &gt; 1)</w:t>
+      <w:proofErr w:type="spellStart"/>
+      <w:r>
+        <w:t>StopRegion</w:t>
+      </w:r>
+      <w:proofErr w:type="spellEnd"/>
+      <w:r>
+        <w:t xml:space="preserve">       (level &gt; 1)</w:t>
       </w:r>
     </w:p>
     <w:p>
@@ -683,8 +1893,13 @@
       <w:pPr>
         <w:spacing w:line="240" w:lineRule="auto"/>
       </w:pPr>
-      <w:r>
-        <w:t>RestartRegion    (level &gt; 1)</w:t>
+      <w:proofErr w:type="spellStart"/>
+      <w:r>
+        <w:t>RestartRegion</w:t>
+      </w:r>
+      <w:proofErr w:type="spellEnd"/>
+      <w:r>
+        <w:t xml:space="preserve">    (level &gt; 1)</w:t>
       </w:r>
     </w:p>
     <w:p>
@@ -700,7 +1915,6 @@
         <w:spacing w:line="240" w:lineRule="auto"/>
       </w:pPr>
       <w:r>
-        <w:lastRenderedPageBreak/>
         <w:t xml:space="preserve">    http://127.0.0.1:8001/?command=RestartRegion&amp;password={HASH}&amp;RegionName=Welcome</w:t>
       </w:r>
     </w:p>
@@ -722,15 +1936,31 @@
         <w:spacing w:line="240" w:lineRule="auto"/>
       </w:pPr>
       <w:r>
-        <w:t xml:space="preserve">    Suspends a region in place (see Help\MCP.txt's note on the</w:t>
-      </w:r>
-    </w:p>
-    <w:p>
-      <w:pPr>
-        <w:spacing w:line="240" w:lineRule="auto"/>
-      </w:pPr>
-      <w:r>
-        <w:t xml:space="preserve">    hourly SmartStart freeze/thaw cycle - this is the same</w:t>
+        <w:t xml:space="preserve">    Suspends a region in place (see Help\</w:t>
+      </w:r>
+      <w:proofErr w:type="spellStart"/>
+      <w:r>
+        <w:t>MCP.txt's</w:t>
+      </w:r>
+      <w:proofErr w:type="spellEnd"/>
+      <w:r>
+        <w:t xml:space="preserve"> note on the</w:t>
+      </w:r>
+    </w:p>
+    <w:p>
+      <w:pPr>
+        <w:spacing w:line="240" w:lineRule="auto"/>
+      </w:pPr>
+      <w:r>
+        <w:t xml:space="preserve">    hourly </w:t>
+      </w:r>
+      <w:proofErr w:type="spellStart"/>
+      <w:r>
+        <w:t>SmartStart</w:t>
+      </w:r>
+      <w:proofErr w:type="spellEnd"/>
+      <w:r>
+        <w:t xml:space="preserve"> freeze/thaw cycle - this is the same</w:t>
       </w:r>
     </w:p>
     <w:p>
@@ -816,8 +2046,13 @@
       <w:pPr>
         <w:spacing w:line="240" w:lineRule="auto"/>
       </w:pPr>
-      <w:r>
-        <w:t>SetStatus        (level &gt; 200)</w:t>
+      <w:proofErr w:type="spellStart"/>
+      <w:r>
+        <w:t>SetStatus</w:t>
+      </w:r>
+      <w:proofErr w:type="spellEnd"/>
+      <w:r>
+        <w:t xml:space="preserve">        (level &gt; 200)</w:t>
       </w:r>
     </w:p>
     <w:p>
@@ -833,15 +2068,47 @@
         <w:spacing w:line="240" w:lineRule="auto"/>
       </w:pPr>
       <w:r>
-        <w:t xml:space="preserve">    Note: unlike the other region commands, SetStatus reads</w:t>
-      </w:r>
-    </w:p>
-    <w:p>
-      <w:pPr>
-        <w:spacing w:line="240" w:lineRule="auto"/>
-      </w:pPr>
-      <w:r>
-        <w:t xml:space="preserve">    RegionUUID only - it does not fall back to RegionName.</w:t>
+        <w:t xml:space="preserve">    Note: unlike the other </w:t>
+      </w:r>
+      <w:proofErr w:type="gramStart"/>
+      <w:r>
+        <w:t>region</w:t>
+      </w:r>
+      <w:proofErr w:type="gramEnd"/>
+      <w:r>
+        <w:t xml:space="preserve"> commands, </w:t>
+      </w:r>
+      <w:proofErr w:type="spellStart"/>
+      <w:r>
+        <w:t>SetStatus</w:t>
+      </w:r>
+      <w:proofErr w:type="spellEnd"/>
+      <w:r>
+        <w:t xml:space="preserve"> reads</w:t>
+      </w:r>
+    </w:p>
+    <w:p>
+      <w:pPr>
+        <w:spacing w:line="240" w:lineRule="auto"/>
+      </w:pPr>
+      <w:r>
+        <w:t xml:space="preserve">    </w:t>
+      </w:r>
+      <w:proofErr w:type="spellStart"/>
+      <w:r>
+        <w:t>RegionUUID</w:t>
+      </w:r>
+      <w:proofErr w:type="spellEnd"/>
+      <w:r>
+        <w:t xml:space="preserve"> only - it does not fall back to </w:t>
+      </w:r>
+      <w:proofErr w:type="spellStart"/>
+      <w:r>
+        <w:t>RegionName</w:t>
+      </w:r>
+      <w:proofErr w:type="spellEnd"/>
+      <w:r>
+        <w:t>.</w:t>
       </w:r>
     </w:p>
     <w:p>
@@ -861,24 +2128,45 @@
       <w:pPr>
         <w:spacing w:line="240" w:lineRule="auto"/>
       </w:pPr>
-      <w:r>
-        <w:t>RegionStatus     (no password required)</w:t>
-      </w:r>
-    </w:p>
-    <w:p>
-      <w:pPr>
-        <w:spacing w:line="240" w:lineRule="auto"/>
-      </w:pPr>
-      <w:r>
-        <w:t xml:space="preserve">    Returns the current status of a region as plain text (Booted,</w:t>
-      </w:r>
-    </w:p>
-    <w:p>
-      <w:pPr>
-        <w:spacing w:line="240" w:lineRule="auto"/>
-      </w:pPr>
-      <w:r>
-        <w:t xml:space="preserve">    Suspended, Stopped, RecyclingDown, Booting, Error, Restart,</w:t>
+      <w:proofErr w:type="spellStart"/>
+      <w:r>
+        <w:t>RegionStatus</w:t>
+      </w:r>
+      <w:proofErr w:type="spellEnd"/>
+      <w:r>
+        <w:t xml:space="preserve">     (no password required)</w:t>
+      </w:r>
+    </w:p>
+    <w:p>
+      <w:pPr>
+        <w:spacing w:line="240" w:lineRule="auto"/>
+      </w:pPr>
+      <w:r>
+        <w:t xml:space="preserve">    Returns the </w:t>
+      </w:r>
+      <w:proofErr w:type="gramStart"/>
+      <w:r>
+        <w:t>current status</w:t>
+      </w:r>
+      <w:proofErr w:type="gramEnd"/>
+      <w:r>
+        <w:t xml:space="preserve"> of a region as plain text (Booted,</w:t>
+      </w:r>
+    </w:p>
+    <w:p>
+      <w:pPr>
+        <w:spacing w:line="240" w:lineRule="auto"/>
+      </w:pPr>
+      <w:r>
+        <w:t xml:space="preserve">    Suspended, Stopped, </w:t>
+      </w:r>
+      <w:proofErr w:type="spellStart"/>
+      <w:r>
+        <w:t>RecyclingDown</w:t>
+      </w:r>
+      <w:proofErr w:type="spellEnd"/>
+      <w:r>
+        <w:t>, Booting, Error, Restart,</w:t>
       </w:r>
     </w:p>
     <w:p>
@@ -943,8 +2231,13 @@
       <w:pPr>
         <w:spacing w:line="240" w:lineRule="auto"/>
       </w:pPr>
-      <w:r>
-        <w:t>SaveOAR          (level &gt; 100)</w:t>
+      <w:proofErr w:type="spellStart"/>
+      <w:r>
+        <w:t>SaveOAR</w:t>
+      </w:r>
+      <w:proofErr w:type="spellEnd"/>
+      <w:r>
+        <w:t xml:space="preserve">          (level &gt; 100)</w:t>
       </w:r>
     </w:p>
     <w:p>
@@ -987,39 +2280,87 @@
         <w:spacing w:line="240" w:lineRule="auto"/>
       </w:pPr>
       <w:r>
-        <w:t xml:space="preserve">    that avatar instead of the MachineHash. Ownership is checked fresh</w:t>
-      </w:r>
-    </w:p>
-    <w:p>
-      <w:pPr>
-        <w:spacing w:line="240" w:lineRule="auto"/>
-      </w:pPr>
-      <w:r>
-        <w:t xml:space="preserve">    against estate_settings/estate_map, not any cached value.</w:t>
-      </w:r>
-    </w:p>
-    <w:p>
-      <w:pPr>
-        <w:spacing w:line="240" w:lineRule="auto"/>
-      </w:pPr>
-      <w:r>
-        <w:t xml:space="preserve">    Once the save completes, the finished .oar is automatically moved</w:t>
-      </w:r>
-    </w:p>
-    <w:p>
-      <w:pPr>
-        <w:spacing w:line="240" w:lineRule="auto"/>
-      </w:pPr>
-      <w:r>
-        <w:t xml:space="preserve">    to OutworldzFiles\Apache\htdocs\API\OAR\{guid}\ and served by</w:t>
-      </w:r>
-    </w:p>
-    <w:p>
-      <w:pPr>
-        <w:spacing w:line="240" w:lineRule="auto"/>
-      </w:pPr>
-      <w:r>
-        <w:t xml:space="preserve">    Apache as a plain download - but ONLY for a self-service (estate-</w:t>
+        <w:t xml:space="preserve">    that avatar instead of the </w:t>
+      </w:r>
+      <w:proofErr w:type="spellStart"/>
+      <w:r>
+        <w:t>MachineHash</w:t>
+      </w:r>
+      <w:proofErr w:type="spellEnd"/>
+      <w:r>
+        <w:t>. Ownership is checked fresh</w:t>
+      </w:r>
+    </w:p>
+    <w:p>
+      <w:pPr>
+        <w:spacing w:line="240" w:lineRule="auto"/>
+      </w:pPr>
+      <w:r>
+        <w:t xml:space="preserve">    against </w:t>
+      </w:r>
+      <w:proofErr w:type="spellStart"/>
+      <w:r>
+        <w:t>estate_settings</w:t>
+      </w:r>
+      <w:proofErr w:type="spellEnd"/>
+      <w:r>
+        <w:t>/</w:t>
+      </w:r>
+      <w:proofErr w:type="spellStart"/>
+      <w:r>
+        <w:t>estate_map</w:t>
+      </w:r>
+      <w:proofErr w:type="spellEnd"/>
+      <w:r>
+        <w:t>, not any cached value.</w:t>
+      </w:r>
+    </w:p>
+    <w:p>
+      <w:pPr>
+        <w:spacing w:line="240" w:lineRule="auto"/>
+      </w:pPr>
+      <w:r>
+        <w:t xml:space="preserve">    Once the save </w:t>
+      </w:r>
+      <w:proofErr w:type="gramStart"/>
+      <w:r>
+        <w:t>completes</w:t>
+      </w:r>
+      <w:proofErr w:type="gramEnd"/>
+      <w:r>
+        <w:t>, the finished .oar is automatically moved</w:t>
+      </w:r>
+    </w:p>
+    <w:p>
+      <w:pPr>
+        <w:spacing w:line="240" w:lineRule="auto"/>
+      </w:pPr>
+      <w:r>
+        <w:t xml:space="preserve">    to OutworldzFiles\Apache\htdocs\API\OAR\{</w:t>
+      </w:r>
+      <w:proofErr w:type="spellStart"/>
+      <w:r>
+        <w:t>guid</w:t>
+      </w:r>
+      <w:proofErr w:type="spellEnd"/>
+      <w:r>
+        <w:t>}\ and served by</w:t>
+      </w:r>
+    </w:p>
+    <w:p>
+      <w:pPr>
+        <w:spacing w:line="240" w:lineRule="auto"/>
+      </w:pPr>
+      <w:r>
+        <w:t xml:space="preserve">    Apache as a plain download - but ONLY for </w:t>
+      </w:r>
+      <w:proofErr w:type="gramStart"/>
+      <w:r>
+        <w:t>a self</w:t>
+      </w:r>
+      <w:proofErr w:type="gramEnd"/>
+      <w:r>
+        <w:t>-service (estate-</w:t>
       </w:r>
     </w:p>
     <w:p>
@@ -1035,31 +2376,63 @@
         <w:spacing w:line="240" w:lineRule="auto"/>
       </w:pPr>
       <w:r>
-        <w:t xml:space="preserve">    this way. If Settings.EmailEnabled and the avatar has a valid email</w:t>
-      </w:r>
-    </w:p>
-    <w:p>
-      <w:pPr>
-        <w:spacing w:line="240" w:lineRule="auto"/>
-      </w:pPr>
-      <w:r>
-        <w:t xml:space="preserve">    on file, the download link is emailed automatically. The link</w:t>
-      </w:r>
-    </w:p>
-    <w:p>
-      <w:pPr>
-        <w:spacing w:line="240" w:lineRule="auto"/>
-      </w:pPr>
-      <w:r>
-        <w:t xml:space="preserve">    expires after Settings.DownloadLinkExpiryHours (default 24) and is</w:t>
-      </w:r>
-    </w:p>
-    <w:p>
-      <w:pPr>
-        <w:spacing w:line="240" w:lineRule="auto"/>
-      </w:pPr>
-      <w:r>
-        <w:t xml:space="preserve">    then deleted. Poll DownloadStatus (below) with Kind=OAR to find out</w:t>
+        <w:t xml:space="preserve">    this way. If </w:t>
+      </w:r>
+      <w:proofErr w:type="spellStart"/>
+      <w:r>
+        <w:t>Settings.EmailEnabled</w:t>
+      </w:r>
+      <w:proofErr w:type="spellEnd"/>
+      <w:r>
+        <w:t xml:space="preserve"> and the avatar has a valid email</w:t>
+      </w:r>
+    </w:p>
+    <w:p>
+      <w:pPr>
+        <w:spacing w:line="240" w:lineRule="auto"/>
+      </w:pPr>
+      <w:r>
+        <w:t xml:space="preserve">    </w:t>
+      </w:r>
+      <w:proofErr w:type="gramStart"/>
+      <w:r>
+        <w:t>on</w:t>
+      </w:r>
+      <w:proofErr w:type="gramEnd"/>
+      <w:r>
+        <w:t xml:space="preserve"> file, the download link is emailed automatically. The link</w:t>
+      </w:r>
+    </w:p>
+    <w:p>
+      <w:pPr>
+        <w:spacing w:line="240" w:lineRule="auto"/>
+      </w:pPr>
+      <w:r>
+        <w:t xml:space="preserve">    expires after </w:t>
+      </w:r>
+      <w:proofErr w:type="spellStart"/>
+      <w:r>
+        <w:t>Settings.DownloadLinkExpiryHours</w:t>
+      </w:r>
+      <w:proofErr w:type="spellEnd"/>
+      <w:r>
+        <w:t xml:space="preserve"> (default 24) and is</w:t>
+      </w:r>
+    </w:p>
+    <w:p>
+      <w:pPr>
+        <w:spacing w:line="240" w:lineRule="auto"/>
+      </w:pPr>
+      <w:r>
+        <w:t xml:space="preserve">    then deleted. Poll </w:t>
+      </w:r>
+      <w:proofErr w:type="spellStart"/>
+      <w:r>
+        <w:t>DownloadStatus</w:t>
+      </w:r>
+      <w:proofErr w:type="spellEnd"/>
+      <w:r>
+        <w:t xml:space="preserve"> (below) with Kind=OAR to find out</w:t>
       </w:r>
     </w:p>
     <w:p>
@@ -1079,8 +2452,13 @@
       <w:pPr>
         <w:spacing w:line="240" w:lineRule="auto"/>
       </w:pPr>
-      <w:r>
-        <w:t>SaveIAR          (level &gt;= 0, but also checks the avatar owns the</w:t>
+      <w:proofErr w:type="spellStart"/>
+      <w:r>
+        <w:t>SaveIAR</w:t>
+      </w:r>
+      <w:proofErr w:type="spellEnd"/>
+      <w:r>
+        <w:t xml:space="preserve">          (level &gt;= 0, but also checks the avatar owns the</w:t>
       </w:r>
     </w:p>
     <w:p>
@@ -1096,7 +2474,15 @@
         <w:spacing w:line="240" w:lineRule="auto"/>
       </w:pPr>
       <w:r>
-        <w:t xml:space="preserve">    Saves an IAR (inventory archive) for one avatar. Always runs via</w:t>
+        <w:t xml:space="preserve">    Saves an IAR (inventory archive) for one avatar. Always </w:t>
+      </w:r>
+      <w:proofErr w:type="gramStart"/>
+      <w:r>
+        <w:t>runs</w:t>
+      </w:r>
+      <w:proofErr w:type="gramEnd"/>
+      <w:r>
+        <w:t xml:space="preserve"> via</w:t>
       </w:r>
     </w:p>
     <w:p>
@@ -1128,15 +2514,39 @@
         <w:spacing w:line="240" w:lineRule="auto"/>
       </w:pPr>
       <w:r>
-        <w:t xml:space="preserve">    Once the save completes, the finished .iar is automatically moved to</w:t>
-      </w:r>
-    </w:p>
-    <w:p>
-      <w:pPr>
-        <w:spacing w:line="240" w:lineRule="auto"/>
-      </w:pPr>
-      <w:r>
-        <w:t xml:space="preserve">    OutworldzFiles\Apache\htdocs\API\IAR\{guid}\ (a freshly generated</w:t>
+        <w:t xml:space="preserve">    Once the save </w:t>
+      </w:r>
+      <w:proofErr w:type="gramStart"/>
+      <w:r>
+        <w:t>completes</w:t>
+      </w:r>
+      <w:proofErr w:type="gramEnd"/>
+      <w:r>
+        <w:t>, the finished .</w:t>
+      </w:r>
+      <w:proofErr w:type="spellStart"/>
+      <w:r>
+        <w:t>iar</w:t>
+      </w:r>
+      <w:proofErr w:type="spellEnd"/>
+      <w:r>
+        <w:t xml:space="preserve"> is automatically moved to</w:t>
+      </w:r>
+    </w:p>
+    <w:p>
+      <w:pPr>
+        <w:spacing w:line="240" w:lineRule="auto"/>
+      </w:pPr>
+      <w:r>
+        <w:t xml:space="preserve">    OutworldzFiles\Apache\htdocs\API\IAR\{</w:t>
+      </w:r>
+      <w:proofErr w:type="spellStart"/>
+      <w:r>
+        <w:t>guid</w:t>
+      </w:r>
+      <w:proofErr w:type="spellEnd"/>
+      <w:r>
+        <w:t>}\ (a freshly generated</w:t>
       </w:r>
     </w:p>
     <w:p>
@@ -1152,7 +2562,15 @@
         <w:spacing w:line="240" w:lineRule="auto"/>
       </w:pPr>
       <w:r>
-        <w:t xml:space="preserve">    download. If Settings.EmailEnabled and the avatar has a valid email</w:t>
+        <w:t xml:space="preserve">    download. If </w:t>
+      </w:r>
+      <w:proofErr w:type="spellStart"/>
+      <w:r>
+        <w:t>Settings.EmailEnabled</w:t>
+      </w:r>
+      <w:proofErr w:type="spellEnd"/>
+      <w:r>
+        <w:t xml:space="preserve"> and the avatar has a valid email</w:t>
       </w:r>
     </w:p>
     <w:p>
@@ -1168,31 +2586,54 @@
         <w:spacing w:line="240" w:lineRule="auto"/>
       </w:pPr>
       <w:r>
-        <w:t xml:space="preserve">    link expires after Settings.DownloadLinkExpiryHours (default 24)</w:t>
-      </w:r>
-    </w:p>
-    <w:p>
-      <w:pPr>
-        <w:spacing w:line="240" w:lineRule="auto"/>
-      </w:pPr>
-      <w:r>
-        <w:t xml:space="preserve">    and is then deleted. Poll DownloadStatus (below) with the same</w:t>
-      </w:r>
-    </w:p>
-    <w:p>
-      <w:pPr>
-        <w:spacing w:line="240" w:lineRule="auto"/>
-      </w:pPr>
-      <w:r>
-        <w:t xml:space="preserve">    AvatarName/password to find out when the file is ready and get the</w:t>
-      </w:r>
-    </w:p>
-    <w:p>
-      <w:pPr>
-        <w:spacing w:line="240" w:lineRule="auto"/>
-      </w:pPr>
-      <w:r>
-        <w:lastRenderedPageBreak/>
+        <w:t xml:space="preserve">    link expires after </w:t>
+      </w:r>
+      <w:proofErr w:type="spellStart"/>
+      <w:r>
+        <w:t>Settings.DownloadLinkExpiryHours</w:t>
+      </w:r>
+      <w:proofErr w:type="spellEnd"/>
+      <w:r>
+        <w:t xml:space="preserve"> (default 24)</w:t>
+      </w:r>
+    </w:p>
+    <w:p>
+      <w:pPr>
+        <w:spacing w:line="240" w:lineRule="auto"/>
+      </w:pPr>
+      <w:r>
+        <w:t xml:space="preserve">    and is then deleted. Poll </w:t>
+      </w:r>
+      <w:proofErr w:type="spellStart"/>
+      <w:r>
+        <w:t>DownloadStatus</w:t>
+      </w:r>
+      <w:proofErr w:type="spellEnd"/>
+      <w:r>
+        <w:t xml:space="preserve"> (below) with the same</w:t>
+      </w:r>
+    </w:p>
+    <w:p>
+      <w:pPr>
+        <w:spacing w:line="240" w:lineRule="auto"/>
+      </w:pPr>
+      <w:r>
+        <w:t xml:space="preserve">    </w:t>
+      </w:r>
+      <w:proofErr w:type="spellStart"/>
+      <w:r>
+        <w:t>AvatarName</w:t>
+      </w:r>
+      <w:proofErr w:type="spellEnd"/>
+      <w:r>
+        <w:t>/password to find out when the file is ready and get the</w:t>
+      </w:r>
+    </w:p>
+    <w:p>
+      <w:pPr>
+        <w:spacing w:line="240" w:lineRule="auto"/>
+      </w:pPr>
+      <w:r>
         <w:t xml:space="preserve">    URL - or just visit http://{PublicIP}:{ApachePort}/API/download.php</w:t>
       </w:r>
     </w:p>
@@ -1216,16 +2657,29 @@
       <w:pPr>
         <w:spacing w:line="240" w:lineRule="auto"/>
       </w:pPr>
-      <w:r>
-        <w:t>DownloadStatus   (level &gt;= 0, but also checks the avatar owns the</w:t>
-      </w:r>
-    </w:p>
-    <w:p>
-      <w:pPr>
-        <w:spacing w:line="240" w:lineRule="auto"/>
-      </w:pPr>
-      <w:r>
-        <w:t xml:space="preserve">                  named download - same check as SaveIAR)</w:t>
+      <w:proofErr w:type="spellStart"/>
+      <w:r>
+        <w:t>DownloadStatus</w:t>
+      </w:r>
+      <w:proofErr w:type="spellEnd"/>
+      <w:r>
+        <w:t xml:space="preserve">   (level &gt;= 0, but also checks the avatar owns the</w:t>
+      </w:r>
+    </w:p>
+    <w:p>
+      <w:pPr>
+        <w:spacing w:line="240" w:lineRule="auto"/>
+      </w:pPr>
+      <w:r>
+        <w:t xml:space="preserve">                  named download - same check as </w:t>
+      </w:r>
+      <w:proofErr w:type="spellStart"/>
+      <w:r>
+        <w:t>SaveIAR</w:t>
+      </w:r>
+      <w:proofErr w:type="spellEnd"/>
+      <w:r>
+        <w:t>)</w:t>
       </w:r>
     </w:p>
     <w:p>
@@ -1241,16 +2695,53 @@
         <w:spacing w:line="240" w:lineRule="auto"/>
       </w:pPr>
       <w:r>
-        <w:t xml:space="preserve">    Returns JSON: {"ready":false} while still processing, or once ready:</w:t>
-      </w:r>
-    </w:p>
-    <w:p>
-      <w:pPr>
-        <w:spacing w:line="240" w:lineRule="auto"/>
-      </w:pPr>
-      <w:r>
-        <w:t xml:space="preserve">    {"ready":true,"url":"...","expiresUtc":"..."}</w:t>
-      </w:r>
+        <w:t xml:space="preserve">    Returns </w:t>
+      </w:r>
+      <w:proofErr w:type="gramStart"/>
+      <w:r>
+        <w:t>JSON: {</w:t>
+      </w:r>
+      <w:proofErr w:type="gramEnd"/>
+      <w:r>
+        <w:t>"</w:t>
+      </w:r>
+      <w:proofErr w:type="spellStart"/>
+      <w:r>
+        <w:t>ready":false</w:t>
+      </w:r>
+      <w:proofErr w:type="spellEnd"/>
+      <w:r>
+        <w:t>} while still processing, or once ready:</w:t>
+      </w:r>
+    </w:p>
+    <w:p>
+      <w:pPr>
+        <w:spacing w:line="240" w:lineRule="auto"/>
+      </w:pPr>
+      <w:r>
+        <w:t xml:space="preserve">    {"ready":true,"</w:t>
+      </w:r>
+      <w:proofErr w:type="spellStart"/>
+      <w:r>
+        <w:t>url</w:t>
+      </w:r>
+      <w:proofErr w:type="spellEnd"/>
+      <w:r>
+        <w:t>":"...","</w:t>
+      </w:r>
+      <w:proofErr w:type="spellStart"/>
+      <w:r>
+        <w:t>expiresUtc</w:t>
+      </w:r>
+      <w:proofErr w:type="spellEnd"/>
+      <w:r>
+        <w:t>":"</w:t>
+      </w:r>
+      <w:proofErr w:type="gramStart"/>
+      <w:r>
+        <w:t>..."}</w:t>
+      </w:r>
+      <w:proofErr w:type="gramEnd"/>
     </w:p>
     <w:p>
       <w:pPr>
@@ -1334,16 +2825,42 @@
         <w:spacing w:line="240" w:lineRule="auto"/>
       </w:pPr>
       <w:r>
-        <w:t>with no page reload needed. This is the same SaveIAR/SaveOAR/</w:t>
-      </w:r>
-    </w:p>
-    <w:p>
-      <w:pPr>
-        <w:spacing w:line="240" w:lineRule="auto"/>
-      </w:pPr>
-      <w:r>
-        <w:t>DownloadStatus API described above, wrapped in a form so nobody has to</w:t>
-      </w:r>
+        <w:t xml:space="preserve">with no page reload needed. This is the same </w:t>
+      </w:r>
+      <w:proofErr w:type="spellStart"/>
+      <w:r>
+        <w:t>SaveIAR</w:t>
+      </w:r>
+      <w:proofErr w:type="spellEnd"/>
+      <w:r>
+        <w:t>/</w:t>
+      </w:r>
+      <w:proofErr w:type="spellStart"/>
+      <w:r>
+        <w:t>SaveOAR</w:t>
+      </w:r>
+      <w:proofErr w:type="spellEnd"/>
+      <w:r>
+        <w:t>/</w:t>
+      </w:r>
+    </w:p>
+    <w:p>
+      <w:pPr>
+        <w:spacing w:line="240" w:lineRule="auto"/>
+      </w:pPr>
+      <w:proofErr w:type="spellStart"/>
+      <w:r>
+        <w:t>DownloadStatus</w:t>
+      </w:r>
+      <w:proofErr w:type="spellEnd"/>
+      <w:r>
+        <w:t xml:space="preserve"> API described above, wrapped in a form so nobody </w:t>
+      </w:r>
+      <w:proofErr w:type="gramStart"/>
+      <w:r>
+        <w:t>has to</w:t>
+      </w:r>
+      <w:proofErr w:type="gramEnd"/>
     </w:p>
     <w:p>
       <w:pPr>
@@ -1382,7 +2899,15 @@
         <w:spacing w:line="240" w:lineRule="auto"/>
       </w:pPr>
       <w:r>
-        <w:t>The main admin dashboard (/API/Index.php) also has "Download IAR"/</w:t>
+        <w:t>The main admin dashboard (/API/</w:t>
+      </w:r>
+      <w:proofErr w:type="spellStart"/>
+      <w:r>
+        <w:t>Index.php</w:t>
+      </w:r>
+      <w:proofErr w:type="spellEnd"/>
+      <w:r>
+        <w:t>) also has "Download IAR"/</w:t>
       </w:r>
     </w:p>
     <w:p>
@@ -1432,7 +2957,6 @@
         <w:spacing w:line="240" w:lineRule="auto"/>
       </w:pPr>
       <w:r>
-        <w:lastRenderedPageBreak/>
         <w:t xml:space="preserve">    returns "Success" if valid, else "NAK ...".</w:t>
       </w:r>
     </w:p>
@@ -1496,15 +3020,31 @@
         <w:spacing w:line="240" w:lineRule="auto"/>
       </w:pPr>
       <w:r>
-        <w:t>name, status, RAM usage, prim count, estate, SmartStart mode, and a</w:t>
-      </w:r>
-    </w:p>
-    <w:p>
-      <w:pPr>
-        <w:spacing w:line="240" w:lineRule="auto"/>
-      </w:pPr>
-      <w:r>
-        <w:t>"hop://" teleport link where applicable.</w:t>
+        <w:t xml:space="preserve">name, status, RAM usage, prim count, estate, </w:t>
+      </w:r>
+      <w:proofErr w:type="spellStart"/>
+      <w:r>
+        <w:t>SmartStart</w:t>
+      </w:r>
+      <w:proofErr w:type="spellEnd"/>
+      <w:r>
+        <w:t xml:space="preserve"> mode, and a</w:t>
+      </w:r>
+    </w:p>
+    <w:p>
+      <w:pPr>
+        <w:spacing w:line="240" w:lineRule="auto"/>
+      </w:pPr>
+      <w:r>
+        <w:t>"</w:t>
+      </w:r>
+      <w:proofErr w:type="gramStart"/>
+      <w:r>
+        <w:t>hop</w:t>
+      </w:r>
+      <w:proofErr w:type="gramEnd"/>
+      <w:r>
+        <w:t>://" teleport link where applicable.</w:t>
       </w:r>
     </w:p>
     <w:p>
@@ -1533,7 +3073,15 @@
         <w:spacing w:line="240" w:lineRule="auto"/>
       </w:pPr>
       <w:r>
-        <w:t xml:space="preserve">    rp          rows per page, default 100.</w:t>
+        <w:t xml:space="preserve">    </w:t>
+      </w:r>
+      <w:proofErr w:type="spellStart"/>
+      <w:r>
+        <w:t>rp</w:t>
+      </w:r>
+      <w:proofErr w:type="spellEnd"/>
+      <w:r>
+        <w:t xml:space="preserve">          rows per page, default 100.</w:t>
       </w:r>
     </w:p>
     <w:p>
@@ -1549,15 +3097,47 @@
         <w:spacing w:line="240" w:lineRule="auto"/>
       </w:pPr>
       <w:r>
-        <w:t xml:space="preserve">    qtype       set to "RegionName" when using "query".</w:t>
-      </w:r>
-    </w:p>
-    <w:p>
-      <w:pPr>
-        <w:spacing w:line="240" w:lineRule="auto"/>
-      </w:pPr>
-      <w:r>
-        <w:t xml:space="preserve">    sortorder   "asc" or "desc" (region name), default "desc".</w:t>
+        <w:t xml:space="preserve">    </w:t>
+      </w:r>
+      <w:proofErr w:type="spellStart"/>
+      <w:r>
+        <w:t>qtype</w:t>
+      </w:r>
+      <w:proofErr w:type="spellEnd"/>
+      <w:r>
+        <w:t xml:space="preserve">       set to "</w:t>
+      </w:r>
+      <w:proofErr w:type="spellStart"/>
+      <w:r>
+        <w:t>RegionName</w:t>
+      </w:r>
+      <w:proofErr w:type="spellEnd"/>
+      <w:r>
+        <w:t>" when using "query".</w:t>
+      </w:r>
+    </w:p>
+    <w:p>
+      <w:pPr>
+        <w:spacing w:line="240" w:lineRule="auto"/>
+      </w:pPr>
+      <w:r>
+        <w:t xml:space="preserve">    </w:t>
+      </w:r>
+      <w:proofErr w:type="spellStart"/>
+      <w:r>
+        <w:t>sortorder</w:t>
+      </w:r>
+      <w:proofErr w:type="spellEnd"/>
+      <w:r>
+        <w:t xml:space="preserve">   "</w:t>
+      </w:r>
+      <w:proofErr w:type="spellStart"/>
+      <w:r>
+        <w:t>asc</w:t>
+      </w:r>
+      <w:proofErr w:type="spellEnd"/>
+      <w:r>
+        <w:t>" or "desc" (region name), default "desc".</w:t>
       </w:r>
     </w:p>
     <w:p>
@@ -1659,7 +3239,6 @@
         <w:spacing w:line="240" w:lineRule="auto"/>
       </w:pPr>
       <w:r>
-        <w:lastRenderedPageBreak/>
         <w:t>Only regions that are running, enabled, and have the "Teleport Sign" checkbox set (Regions -&gt; Options tab) are included. The Welcome region is always first when Start=1.</w:t>
       </w:r>
     </w:p>
@@ -1836,7 +3415,15 @@
         <w:spacing w:line="240" w:lineRule="auto"/>
       </w:pPr>
       <w:r>
-        <w:t xml:space="preserve">                          console. The .wav is OpenSim/Second Life</w:t>
+        <w:t xml:space="preserve">                          console. The .</w:t>
+      </w:r>
+      <w:proofErr w:type="gramStart"/>
+      <w:r>
+        <w:t>wav</w:t>
+      </w:r>
+      <w:proofErr w:type="gramEnd"/>
+      <w:r>
+        <w:t xml:space="preserve"> is OpenSim/Second Life</w:t>
       </w:r>
     </w:p>
     <w:p>
@@ -1875,7 +3462,15 @@
         </w:rPr>
       </w:pPr>
       <w:r>
-        <w:t>DreamGrid also exposes a "speak" / "speak_to_file" pair of MCP tools that call this same speech engine directly (bypassing the APIKey check, since MCP has its own permission model) - see Help\MCP.txt.</w:t>
+        <w:t>DreamGrid also exposes a "speak" / "</w:t>
+      </w:r>
+      <w:proofErr w:type="spellStart"/>
+      <w:r>
+        <w:t>speak_to_file</w:t>
+      </w:r>
+      <w:proofErr w:type="spellEnd"/>
+      <w:r>
+        <w:t>" pair of MCP tools that call this same speech engine directly (bypassing the APIKey check, since MCP has its own permission model) - see Help\MCP.txt.</w:t>
       </w:r>
     </w:p>
     <w:sectPr>
@@ -3437,7 +5032,7 @@
   <w:docDefaults>
     <w:rPrDefault>
       <w:rPr>
-        <w:rFonts w:asciiTheme="minorHAnsi" w:eastAsiaTheme="minorEastAsia" w:hAnsiTheme="minorHAnsi" w:cs="Times New Roman"/>
+        <w:rFonts w:asciiTheme="minorHAnsi" w:eastAsiaTheme="minorEastAsia" w:hAnsiTheme="minorHAnsi" w:cstheme="minorBidi"/>
         <w:lang w:val="en-US" w:eastAsia="en-US" w:bidi="ar-SA"/>
       </w:rPr>
     </w:rPrDefault>
@@ -3828,10 +5423,7 @@
   <w:style w:type="paragraph" w:default="1" w:styleId="Normal">
     <w:name w:val="Normal"/>
     <w:qFormat/>
-    <w:rsid w:val="00FA5623"/>
-    <w:rPr>
-      <w:rFonts w:ascii="Verdana" w:hAnsi="Verdana"/>
-    </w:rPr>
+    <w:rsid w:val="005F4E12"/>
   </w:style>
   <w:style w:type="paragraph" w:styleId="Heading1">
     <w:name w:val="heading 1"/>
@@ -3840,7 +5432,7 @@
     <w:link w:val="Heading1Char"/>
     <w:uiPriority w:val="9"/>
     <w:qFormat/>
-    <w:rsid w:val="002D5B62"/>
+    <w:rsid w:val="005F4E12"/>
     <w:pPr>
       <w:pBdr>
         <w:top w:val="single" w:sz="24" w:space="0" w:color="4472C4" w:themeColor="accent1"/>
@@ -3868,7 +5460,7 @@
     <w:uiPriority w:val="9"/>
     <w:unhideWhenUsed/>
     <w:qFormat/>
-    <w:rsid w:val="002D5B62"/>
+    <w:rsid w:val="005F4E12"/>
     <w:pPr>
       <w:pBdr>
         <w:top w:val="single" w:sz="24" w:space="0" w:color="D9E2F3" w:themeColor="accent1" w:themeTint="33"/>
@@ -3893,7 +5485,7 @@
     <w:uiPriority w:val="9"/>
     <w:unhideWhenUsed/>
     <w:qFormat/>
-    <w:rsid w:val="002D5B62"/>
+    <w:rsid w:val="005F4E12"/>
     <w:pPr>
       <w:pBdr>
         <w:top w:val="single" w:sz="6" w:space="2" w:color="4472C4" w:themeColor="accent1"/>
@@ -3915,7 +5507,7 @@
     <w:uiPriority w:val="9"/>
     <w:unhideWhenUsed/>
     <w:qFormat/>
-    <w:rsid w:val="002D5B62"/>
+    <w:rsid w:val="005F4E12"/>
     <w:pPr>
       <w:pBdr>
         <w:top w:val="dotted" w:sz="6" w:space="2" w:color="4472C4" w:themeColor="accent1"/>
@@ -3938,7 +5530,7 @@
     <w:semiHidden/>
     <w:unhideWhenUsed/>
     <w:qFormat/>
-    <w:rsid w:val="002D5B62"/>
+    <w:rsid w:val="005F4E12"/>
     <w:pPr>
       <w:pBdr>
         <w:bottom w:val="single" w:sz="6" w:space="1" w:color="4472C4" w:themeColor="accent1"/>
@@ -3961,7 +5553,7 @@
     <w:semiHidden/>
     <w:unhideWhenUsed/>
     <w:qFormat/>
-    <w:rsid w:val="002D5B62"/>
+    <w:rsid w:val="005F4E12"/>
     <w:pPr>
       <w:pBdr>
         <w:bottom w:val="dotted" w:sz="6" w:space="1" w:color="4472C4" w:themeColor="accent1"/>
@@ -3984,7 +5576,7 @@
     <w:semiHidden/>
     <w:unhideWhenUsed/>
     <w:qFormat/>
-    <w:rsid w:val="002D5B62"/>
+    <w:rsid w:val="005F4E12"/>
     <w:pPr>
       <w:spacing w:before="200" w:after="0"/>
       <w:outlineLvl w:val="6"/>
@@ -4004,7 +5596,7 @@
     <w:semiHidden/>
     <w:unhideWhenUsed/>
     <w:qFormat/>
-    <w:rsid w:val="002D5B62"/>
+    <w:rsid w:val="005F4E12"/>
     <w:pPr>
       <w:spacing w:before="200" w:after="0"/>
       <w:outlineLvl w:val="7"/>
@@ -4025,7 +5617,7 @@
     <w:semiHidden/>
     <w:unhideWhenUsed/>
     <w:qFormat/>
-    <w:rsid w:val="002D5B62"/>
+    <w:rsid w:val="005F4E12"/>
     <w:pPr>
       <w:spacing w:before="200" w:after="0"/>
       <w:outlineLvl w:val="8"/>
@@ -4072,9 +5664,8 @@
     <w:link w:val="Heading1"/>
     <w:uiPriority w:val="9"/>
     <w:locked/>
-    <w:rsid w:val="002D5B62"/>
+    <w:rsid w:val="005F4E12"/>
     <w:rPr>
-      <w:rFonts w:cs="Times New Roman"/>
       <w:caps/>
       <w:color w:val="FFFFFF" w:themeColor="background1"/>
       <w:spacing w:val="15"/>
@@ -4089,9 +5680,8 @@
     <w:link w:val="Heading2"/>
     <w:uiPriority w:val="9"/>
     <w:locked/>
-    <w:rsid w:val="002D5B62"/>
+    <w:rsid w:val="005F4E12"/>
     <w:rPr>
-      <w:rFonts w:cs="Times New Roman"/>
       <w:caps/>
       <w:spacing w:val="15"/>
       <w:shd w:val="clear" w:color="auto" w:fill="D9E2F3" w:themeFill="accent1" w:themeFillTint="33"/>
@@ -4103,9 +5693,8 @@
     <w:link w:val="Heading3"/>
     <w:uiPriority w:val="9"/>
     <w:locked/>
-    <w:rsid w:val="002D5B62"/>
+    <w:rsid w:val="005F4E12"/>
     <w:rPr>
-      <w:rFonts w:cs="Times New Roman"/>
       <w:caps/>
       <w:color w:val="1F3763" w:themeColor="accent1" w:themeShade="7F"/>
       <w:spacing w:val="15"/>
@@ -4117,9 +5706,8 @@
     <w:link w:val="Heading4"/>
     <w:uiPriority w:val="9"/>
     <w:locked/>
-    <w:rsid w:val="002D5B62"/>
+    <w:rsid w:val="005F4E12"/>
     <w:rPr>
-      <w:rFonts w:cs="Times New Roman"/>
       <w:caps/>
       <w:color w:val="2F5496" w:themeColor="accent1" w:themeShade="BF"/>
       <w:spacing w:val="10"/>
@@ -4132,9 +5720,8 @@
     <w:uiPriority w:val="9"/>
     <w:semiHidden/>
     <w:locked/>
-    <w:rsid w:val="002D5B62"/>
+    <w:rsid w:val="005F4E12"/>
     <w:rPr>
-      <w:rFonts w:cs="Times New Roman"/>
       <w:caps/>
       <w:color w:val="2F5496" w:themeColor="accent1" w:themeShade="BF"/>
       <w:spacing w:val="10"/>
@@ -4147,9 +5734,8 @@
     <w:uiPriority w:val="9"/>
     <w:semiHidden/>
     <w:locked/>
-    <w:rsid w:val="002D5B62"/>
+    <w:rsid w:val="005F4E12"/>
     <w:rPr>
-      <w:rFonts w:cs="Times New Roman"/>
       <w:caps/>
       <w:color w:val="2F5496" w:themeColor="accent1" w:themeShade="BF"/>
       <w:spacing w:val="10"/>
@@ -4162,9 +5748,8 @@
     <w:uiPriority w:val="9"/>
     <w:semiHidden/>
     <w:locked/>
-    <w:rsid w:val="002D5B62"/>
+    <w:rsid w:val="005F4E12"/>
     <w:rPr>
-      <w:rFonts w:cs="Times New Roman"/>
       <w:caps/>
       <w:color w:val="2F5496" w:themeColor="accent1" w:themeShade="BF"/>
       <w:spacing w:val="10"/>
@@ -4177,9 +5762,8 @@
     <w:uiPriority w:val="9"/>
     <w:semiHidden/>
     <w:locked/>
-    <w:rsid w:val="002D5B62"/>
+    <w:rsid w:val="005F4E12"/>
     <w:rPr>
-      <w:rFonts w:cs="Times New Roman"/>
       <w:caps/>
       <w:spacing w:val="10"/>
       <w:sz w:val="18"/>
@@ -4193,9 +5777,8 @@
     <w:uiPriority w:val="9"/>
     <w:semiHidden/>
     <w:locked/>
-    <w:rsid w:val="002D5B62"/>
+    <w:rsid w:val="005F4E12"/>
     <w:rPr>
-      <w:rFonts w:cs="Times New Roman"/>
       <w:i/>
       <w:iCs/>
       <w:caps/>
@@ -4252,12 +5835,12 @@
     <w:link w:val="TitleChar"/>
     <w:uiPriority w:val="10"/>
     <w:qFormat/>
-    <w:rsid w:val="002D5B62"/>
+    <w:rsid w:val="005F4E12"/>
     <w:pPr>
       <w:spacing w:before="0" w:after="0"/>
     </w:pPr>
     <w:rPr>
-      <w:rFonts w:asciiTheme="majorHAnsi" w:eastAsiaTheme="majorEastAsia" w:hAnsiTheme="majorHAnsi"/>
+      <w:rFonts w:asciiTheme="majorHAnsi" w:eastAsiaTheme="majorEastAsia" w:hAnsiTheme="majorHAnsi" w:cstheme="majorBidi"/>
       <w:caps/>
       <w:color w:val="4472C4" w:themeColor="accent1"/>
       <w:spacing w:val="10"/>
@@ -4271,9 +5854,9 @@
     <w:link w:val="Title"/>
     <w:uiPriority w:val="10"/>
     <w:locked/>
-    <w:rsid w:val="002D5B62"/>
+    <w:rsid w:val="005F4E12"/>
     <w:rPr>
-      <w:rFonts w:asciiTheme="majorHAnsi" w:eastAsiaTheme="majorEastAsia" w:hAnsiTheme="majorHAnsi" w:cs="Times New Roman"/>
+      <w:rFonts w:asciiTheme="majorHAnsi" w:eastAsiaTheme="majorEastAsia" w:hAnsiTheme="majorHAnsi" w:cstheme="majorBidi"/>
       <w:caps/>
       <w:color w:val="4472C4" w:themeColor="accent1"/>
       <w:spacing w:val="10"/>
@@ -4289,7 +5872,7 @@
     <w:semiHidden/>
     <w:unhideWhenUsed/>
     <w:qFormat/>
-    <w:rsid w:val="002D5B62"/>
+    <w:rsid w:val="005F4E12"/>
     <w:rPr>
       <w:b/>
       <w:bCs/>
@@ -4305,7 +5888,7 @@
     <w:link w:val="SubtitleChar"/>
     <w:uiPriority w:val="11"/>
     <w:qFormat/>
-    <w:rsid w:val="002D5B62"/>
+    <w:rsid w:val="005F4E12"/>
     <w:pPr>
       <w:spacing w:before="0" w:after="500" w:line="240" w:lineRule="auto"/>
     </w:pPr>
@@ -4323,9 +5906,8 @@
     <w:link w:val="Subtitle"/>
     <w:uiPriority w:val="11"/>
     <w:locked/>
-    <w:rsid w:val="002D5B62"/>
+    <w:rsid w:val="005F4E12"/>
     <w:rPr>
-      <w:rFonts w:cs="Times New Roman"/>
       <w:caps/>
       <w:color w:val="595959" w:themeColor="text1" w:themeTint="A6"/>
       <w:spacing w:val="10"/>
@@ -4335,23 +5917,20 @@
   </w:style>
   <w:style w:type="character" w:styleId="Strong">
     <w:name w:val="Strong"/>
-    <w:basedOn w:val="DefaultParagraphFont"/>
     <w:uiPriority w:val="22"/>
     <w:qFormat/>
-    <w:rsid w:val="002D5B62"/>
+    <w:rsid w:val="005F4E12"/>
     <w:rPr>
-      <w:rFonts w:cs="Times New Roman"/>
       <w:b/>
+      <w:bCs/>
     </w:rPr>
   </w:style>
   <w:style w:type="character" w:styleId="Emphasis">
     <w:name w:val="Emphasis"/>
-    <w:basedOn w:val="DefaultParagraphFont"/>
     <w:uiPriority w:val="20"/>
     <w:qFormat/>
-    <w:rsid w:val="002D5B62"/>
+    <w:rsid w:val="005F4E12"/>
     <w:rPr>
-      <w:rFonts w:cs="Times New Roman"/>
       <w:caps/>
       <w:color w:val="1F3763" w:themeColor="accent1" w:themeShade="7F"/>
       <w:spacing w:val="5"/>
@@ -4361,7 +5940,7 @@
     <w:name w:val="No Spacing"/>
     <w:uiPriority w:val="1"/>
     <w:qFormat/>
-    <w:rsid w:val="002D5B62"/>
+    <w:rsid w:val="005F4E12"/>
     <w:pPr>
       <w:spacing w:after="0" w:line="240" w:lineRule="auto"/>
     </w:pPr>
@@ -4373,7 +5952,7 @@
     <w:link w:val="QuoteChar"/>
     <w:uiPriority w:val="29"/>
     <w:qFormat/>
-    <w:rsid w:val="002D5B62"/>
+    <w:rsid w:val="005F4E12"/>
     <w:rPr>
       <w:i/>
       <w:iCs/>
@@ -4387,9 +5966,8 @@
     <w:link w:val="Quote"/>
     <w:uiPriority w:val="29"/>
     <w:locked/>
-    <w:rsid w:val="002D5B62"/>
+    <w:rsid w:val="005F4E12"/>
     <w:rPr>
-      <w:rFonts w:cs="Times New Roman"/>
       <w:i/>
       <w:iCs/>
       <w:sz w:val="24"/>
@@ -4403,7 +5981,7 @@
     <w:link w:val="IntenseQuoteChar"/>
     <w:uiPriority w:val="30"/>
     <w:qFormat/>
-    <w:rsid w:val="002D5B62"/>
+    <w:rsid w:val="005F4E12"/>
     <w:pPr>
       <w:spacing w:before="240" w:after="240" w:line="240" w:lineRule="auto"/>
       <w:ind w:left="1080" w:right="1080"/>
@@ -4421,9 +5999,8 @@
     <w:link w:val="IntenseQuote"/>
     <w:uiPriority w:val="30"/>
     <w:locked/>
-    <w:rsid w:val="002D5B62"/>
+    <w:rsid w:val="005F4E12"/>
     <w:rPr>
-      <w:rFonts w:cs="Times New Roman"/>
       <w:color w:val="4472C4" w:themeColor="accent1"/>
       <w:sz w:val="24"/>
       <w:szCs w:val="24"/>
@@ -4431,25 +6008,23 @@
   </w:style>
   <w:style w:type="character" w:styleId="SubtleEmphasis">
     <w:name w:val="Subtle Emphasis"/>
-    <w:basedOn w:val="DefaultParagraphFont"/>
     <w:uiPriority w:val="19"/>
     <w:qFormat/>
-    <w:rsid w:val="002D5B62"/>
+    <w:rsid w:val="005F4E12"/>
     <w:rPr>
-      <w:rFonts w:cs="Times New Roman"/>
       <w:i/>
+      <w:iCs/>
       <w:color w:val="1F3763" w:themeColor="accent1" w:themeShade="7F"/>
     </w:rPr>
   </w:style>
   <w:style w:type="character" w:styleId="IntenseEmphasis">
     <w:name w:val="Intense Emphasis"/>
-    <w:basedOn w:val="DefaultParagraphFont"/>
     <w:uiPriority w:val="21"/>
     <w:qFormat/>
-    <w:rsid w:val="002D5B62"/>
+    <w:rsid w:val="005F4E12"/>
     <w:rPr>
-      <w:rFonts w:cs="Times New Roman"/>
       <w:b/>
+      <w:bCs/>
       <w:caps/>
       <w:color w:val="1F3763" w:themeColor="accent1" w:themeShade="7F"/>
       <w:spacing w:val="10"/>
@@ -4457,40 +6032,39 @@
   </w:style>
   <w:style w:type="character" w:styleId="SubtleReference">
     <w:name w:val="Subtle Reference"/>
-    <w:basedOn w:val="DefaultParagraphFont"/>
     <w:uiPriority w:val="31"/>
     <w:qFormat/>
-    <w:rsid w:val="002D5B62"/>
+    <w:rsid w:val="005F4E12"/>
     <w:rPr>
-      <w:rFonts w:cs="Times New Roman"/>
       <w:b/>
+      <w:bCs/>
       <w:color w:val="4472C4" w:themeColor="accent1"/>
     </w:rPr>
   </w:style>
   <w:style w:type="character" w:styleId="IntenseReference">
     <w:name w:val="Intense Reference"/>
-    <w:basedOn w:val="DefaultParagraphFont"/>
     <w:uiPriority w:val="32"/>
     <w:qFormat/>
-    <w:rsid w:val="002D5B62"/>
+    <w:rsid w:val="005F4E12"/>
     <w:rPr>
-      <w:rFonts w:cs="Times New Roman"/>
       <w:b/>
+      <w:bCs/>
       <w:i/>
+      <w:iCs/>
       <w:caps/>
       <w:color w:val="4472C4" w:themeColor="accent1"/>
     </w:rPr>
   </w:style>
   <w:style w:type="character" w:styleId="BookTitle">
     <w:name w:val="Book Title"/>
-    <w:basedOn w:val="DefaultParagraphFont"/>
     <w:uiPriority w:val="33"/>
     <w:qFormat/>
-    <w:rsid w:val="002D5B62"/>
+    <w:rsid w:val="005F4E12"/>
     <w:rPr>
-      <w:rFonts w:cs="Times New Roman"/>
       <w:b/>
+      <w:bCs/>
       <w:i/>
+      <w:iCs/>
       <w:spacing w:val="0"/>
     </w:rPr>
   </w:style>
@@ -4502,7 +6076,7 @@
     <w:semiHidden/>
     <w:unhideWhenUsed/>
     <w:qFormat/>
-    <w:rsid w:val="002D5B62"/>
+    <w:rsid w:val="005F4E12"/>
     <w:pPr>
       <w:outlineLvl w:val="9"/>
     </w:pPr>

</xml_diff>

<commit_message>
MCP and API manuals: every /mcp call needs an administrator's name and password
The MachineHash is no longer accepted on /mcp, and the read-only tools and
speech need the name and password too (user level 200 or more). The lock
after five wrong passwords is described. The curl examples carry avatar
and password. API manual: /mcp is on the diagnostics port, not the Apache
port.

Co-Authored-By: Claude Opus 5.5 <noreply@anthropic.com>
</commit_message>
<xml_diff>
--- a/API.docx
+++ b/API.docx
@@ -98,31 +98,31 @@
         <w:spacing w:line="240" w:lineRule="auto"/>
       </w:pPr>
       <w:r>
-        <w:t xml:space="preserve">DreamGrid also exposes this same control surface as an MCP </w:t>
+        <w:t xml:space="preserve">DreamGrid also exposes this same control surface as an MCP serverfor AI clients like Claude, at /mcp on this same diagnostics port. On /mcp every call needs the name and password of a grid administrator (user level 200 or more); the MachineHash is not accepted there. See the MCP manual. </w:t>
       </w:r>
       <w:proofErr w:type="spellStart"/>
       <w:proofErr w:type="gramStart"/>
       <w:r>
-        <w:t>serverfor</w:t>
+        <w:t/>
       </w:r>
       <w:proofErr w:type="spellEnd"/>
       <w:proofErr w:type="gramEnd"/>
       <w:r>
-        <w:t xml:space="preserve"> AI clients like Claude, at /</w:t>
-      </w:r>
-      <w:proofErr w:type="spellStart"/>
-      <w:r>
-        <w:t>mcp</w:t>
-      </w:r>
-      <w:proofErr w:type="spellEnd"/>
-      <w:r>
-        <w:t xml:space="preserve"> on</w:t>
-      </w:r>
-      <w:r>
-        <w:t xml:space="preserve"> the Apache port.</w:t>
-      </w:r>
-      <w:r>
-        <w:t xml:space="preserve"> </w:t>
+        <w:t xml:space="preserve"/>
+      </w:r>
+      <w:proofErr w:type="spellStart"/>
+      <w:r>
+        <w:t/>
+      </w:r>
+      <w:proofErr w:type="spellEnd"/>
+      <w:r>
+        <w:t xml:space="preserve"/>
+      </w:r>
+      <w:r>
+        <w:t xml:space="preserve"/>
+      </w:r>
+      <w:r>
+        <w:t xml:space="preserve"/>
       </w:r>
     </w:p>
     <w:p>

</xml_diff>